<commit_message>
chore: prepare MIT open-source project
</commit_message>
<xml_diff>
--- a/backend/app/assets/word_templates/weekly_plan.docx
+++ b/backend/app/assets/word_templates/weekly_plan.docx
@@ -21,7 +21,7 @@
           <w:sz w:val="32"/>
           <w:szCs w:val="32"/>
         </w:rPr>
-        <w:t>南通市崇川区樾府幼儿园每周工作计划表</w:t>
+        <w:t xml:space="preserve">每周工作计划表</w:t>
       </w:r>
     </w:p>
     <w:p>
@@ -38,29 +38,7 @@
           <w:sz w:val="24"/>
           <w:szCs w:val="24"/>
         </w:rPr>
-        <w:t>主题名称：《我是中班小朋友》 班级：中四班 第（一）周</w:t>
-      </w:r>
-      <w:r>
-        <w:rPr>
-          <w:rFonts w:ascii="宋体" w:hAnsi="宋体" w:cs="宋体" w:hint="eastAsia"/>
-          <w:sz w:val="24"/>
-        </w:rPr>
-        <w:t>（2026 年 9 月1日——9月</w:t>
-      </w:r>
-      <w:r>
-        <w:rPr>
-          <w:rFonts w:ascii="宋体" w:hAnsi="宋体" w:cs="宋体" w:hint="eastAsia"/>
-          <w:color w:val="000000"/>
-          <w:sz w:val="24"/>
-        </w:rPr>
-        <w:t>4日</w:t>
-      </w:r>
-      <w:r>
-        <w:rPr>
-          <w:rFonts w:ascii="宋体" w:hAnsi="宋体" w:cs="宋体" w:hint="eastAsia"/>
-          <w:sz w:val="24"/>
-        </w:rPr>
-        <w:t>）</w:t>
+        <w:t xml:space="preserve">主题名称：《》 班级： 第（ ）周（ 年 月 日—— 月 日）</w:t>
       </w:r>
     </w:p>
     <w:p>
@@ -76,7 +54,7 @@
           <w:rFonts w:ascii="宋体" w:hAnsi="宋体" w:cs="宋体" w:hint="eastAsia"/>
           <w:sz w:val="24"/>
         </w:rPr>
-        <w:t>教师： 戚甦甦 岳炜  保育员：朱维维</w:t>
+        <w:t xml:space="preserve">教师： 保育员：</w:t>
       </w:r>
     </w:p>
     <w:tbl>
@@ -149,6 +127,7 @@
                 <w:szCs w:val="24"/>
               </w:rPr>
             </w:pPr>
+            <w:r/>
           </w:p>
         </w:tc>
         <w:tc>
@@ -420,6 +399,7 @@
                 <w:szCs w:val="24"/>
               </w:rPr>
             </w:pPr>
+            <w:r/>
           </w:p>
         </w:tc>
         <w:tc>
@@ -447,7 +427,6 @@
                 <w:sz w:val="24"/>
                 <w:szCs w:val="24"/>
               </w:rPr>
-              <w:t>暑假趣事多</w:t>
             </w:r>
           </w:p>
         </w:tc>
@@ -476,7 +455,6 @@
                 <w:sz w:val="24"/>
                 <w:szCs w:val="24"/>
               </w:rPr>
-              <w:t>镜子里的我</w:t>
             </w:r>
           </w:p>
         </w:tc>
@@ -505,7 +483,6 @@
                 <w:sz w:val="24"/>
                 <w:szCs w:val="24"/>
               </w:rPr>
-              <w:t>我的好朋友</w:t>
             </w:r>
           </w:p>
         </w:tc>
@@ -534,7 +511,6 @@
                 <w:sz w:val="24"/>
                 <w:szCs w:val="24"/>
               </w:rPr>
-              <w:t>夸夸能干的我</w:t>
             </w:r>
           </w:p>
         </w:tc>
@@ -565,6 +541,7 @@
                 <w:szCs w:val="24"/>
               </w:rPr>
             </w:pPr>
+            <w:r/>
           </w:p>
         </w:tc>
         <w:tc>
@@ -633,6 +610,7 @@
                 <w:szCs w:val="24"/>
               </w:rPr>
             </w:pPr>
+            <w:r/>
           </w:p>
         </w:tc>
         <w:tc>
@@ -660,7 +638,6 @@
                 <w:sz w:val="24"/>
                 <w:szCs w:val="24"/>
               </w:rPr>
-              <w:t>综合：开学第一课</w:t>
             </w:r>
           </w:p>
         </w:tc>
@@ -689,7 +666,6 @@
                 <w:sz w:val="24"/>
                 <w:szCs w:val="24"/>
               </w:rPr>
-              <w:t>美术：中班的我</w:t>
             </w:r>
           </w:p>
         </w:tc>
@@ -720,7 +696,6 @@
                 <w:sz w:val="24"/>
                 <w:szCs w:val="24"/>
               </w:rPr>
-              <w:t>社会：我们在一起</w:t>
             </w:r>
           </w:p>
         </w:tc>
@@ -751,7 +726,6 @@
                 <w:sz w:val="24"/>
                 <w:szCs w:val="24"/>
               </w:rPr>
-              <w:t>音乐：我是中班小朋友</w:t>
             </w:r>
           </w:p>
         </w:tc>
@@ -881,58 +855,6 @@
                 <w:sz w:val="24"/>
                 <w:szCs w:val="24"/>
               </w:rPr>
-              <w:t>体能大循环</w:t>
-            </w:r>
-          </w:p>
-          <w:p>
-            <w:pPr>
-              <w:rPr>
-                <w:rFonts w:ascii="宋体" w:hAnsi="宋体" w:cs="宋体"/>
-                <w:sz w:val="24"/>
-                <w:szCs w:val="24"/>
-              </w:rPr>
-            </w:pPr>
-            <w:r>
-              <w:rPr>
-                <w:rFonts w:ascii="宋体" w:hAnsi="宋体" w:cs="宋体" w:hint="eastAsia"/>
-                <w:sz w:val="24"/>
-                <w:szCs w:val="24"/>
-              </w:rPr>
-              <w:t>集体游戏：1.《老狼老狼几点了》（目标：①练习听信号追逐跑和四散躲闪跑，发展奔跑能力和快速反应能力。②理解并遵守游戏规则：听到“天黑了”才能跑回家，跑动时不推挤、不碰撞，初步掌握躲闪的自我保护方法。③感受追逐游戏的紧张与快乐，喜欢参加集体体育活动，尽快适应开学后的幼儿园生活。）</w:t>
-            </w:r>
-          </w:p>
-          <w:p>
-            <w:pPr>
-              <w:rPr>
-                <w:rFonts w:ascii="宋体" w:hAnsi="宋体" w:cs="宋体"/>
-                <w:sz w:val="24"/>
-                <w:szCs w:val="24"/>
-              </w:rPr>
-            </w:pPr>
-            <w:r>
-              <w:rPr>
-                <w:rFonts w:ascii="宋体" w:hAnsi="宋体" w:cs="宋体" w:hint="eastAsia"/>
-                <w:sz w:val="24"/>
-                <w:szCs w:val="24"/>
-              </w:rPr>
-              <w:t>2.《小刺猬运果子》（目标：①练习走平衡木“小桥”，并在行进中弯腰拾取“果子”，发展平衡能力和身体控制能力。②知道“一次运一个果子、排队过小桥”的规则，不抢先、不掉队，初步恢复有序活动的常规习惯。③在帮助刺猬妈妈运果子的情境中体验劳动的快乐，萌发任务意识和关爱他人的情感。）</w:t>
-            </w:r>
-          </w:p>
-          <w:p>
-            <w:pPr>
-              <w:rPr>
-                <w:rFonts w:ascii="宋体" w:hAnsi="宋体" w:cs="宋体"/>
-                <w:sz w:val="24"/>
-                <w:szCs w:val="24"/>
-              </w:rPr>
-            </w:pPr>
-            <w:r>
-              <w:rPr>
-                <w:rFonts w:ascii="宋体" w:hAnsi="宋体" w:cs="宋体" w:hint="eastAsia"/>
-                <w:sz w:val="24"/>
-                <w:szCs w:val="24"/>
-              </w:rPr>
-              <w:t>自主游戏：《圈圈乐》（目标：①探索呼啦圈的一物多玩（跳圈、滚圈、钻圈、转圈），发展跳跃、钻爬等基本动作和身体协调性。②大胆尝试自己创设玩法，与同伴分享新玩法，体验探索的乐趣。③愿意与同伴轮流、交换玩具，游戏结束后能主动把圈放回原位，养成初步的收拾整理习惯。）</w:t>
             </w:r>
           </w:p>
         </w:tc>
@@ -964,6 +886,7 @@
                 <w:szCs w:val="24"/>
               </w:rPr>
             </w:pPr>
+            <w:r/>
           </w:p>
         </w:tc>
         <w:tc>
@@ -1038,177 +961,6 @@
                 <w:sz w:val="24"/>
                 <w:szCs w:val="24"/>
               </w:rPr>
-              <w:t>1.户外游戏 2.区域游戏 3.专用室</w:t>
-            </w:r>
-          </w:p>
-          <w:p>
-            <w:pPr>
-              <w:rPr>
-                <w:rFonts w:ascii="宋体" w:hAnsi="宋体" w:cs="宋体"/>
-                <w:sz w:val="24"/>
-                <w:szCs w:val="24"/>
-              </w:rPr>
-            </w:pPr>
-            <w:r>
-              <w:rPr>
-                <w:rFonts w:ascii="宋体" w:hAnsi="宋体" w:cs="宋体" w:hint="eastAsia"/>
-                <w:sz w:val="24"/>
-                <w:szCs w:val="24"/>
-              </w:rPr>
-              <w:t>本周重点指导区域：攀爬区</w:t>
-            </w:r>
-          </w:p>
-          <w:p>
-            <w:pPr>
-              <w:rPr>
-                <w:rFonts w:ascii="宋体" w:hAnsi="宋体" w:cs="宋体"/>
-                <w:sz w:val="24"/>
-                <w:szCs w:val="24"/>
-              </w:rPr>
-            </w:pPr>
-            <w:r>
-              <w:rPr>
-                <w:rFonts w:ascii="宋体" w:hAnsi="宋体" w:cs="宋体" w:hint="eastAsia"/>
-                <w:sz w:val="24"/>
-                <w:szCs w:val="24"/>
-              </w:rPr>
-              <w:t>目标：</w:t>
-            </w:r>
-          </w:p>
-          <w:p>
-            <w:pPr>
-              <w:rPr>
-                <w:rFonts w:ascii="宋体" w:hAnsi="宋体" w:cs="宋体"/>
-                <w:sz w:val="24"/>
-                <w:szCs w:val="24"/>
-              </w:rPr>
-            </w:pPr>
-            <w:r>
-              <w:rPr>
-                <w:rFonts w:ascii="宋体" w:hAnsi="宋体" w:cs="宋体" w:hint="eastAsia"/>
-                <w:sz w:val="24"/>
-                <w:szCs w:val="24"/>
-              </w:rPr>
-              <w:t>1.能手脚协调地攀爬不同难度的攀爬架和攀爬网，发展上肢力量、手脚协调性和身体控制能力。</w:t>
-            </w:r>
-          </w:p>
-          <w:p>
-            <w:pPr>
-              <w:rPr>
-                <w:rFonts w:ascii="宋体" w:hAnsi="宋体" w:cs="宋体"/>
-                <w:sz w:val="24"/>
-                <w:szCs w:val="24"/>
-              </w:rPr>
-            </w:pPr>
-            <w:r>
-              <w:rPr>
-                <w:rFonts w:ascii="宋体" w:hAnsi="宋体" w:cs="宋体" w:hint="eastAsia"/>
-                <w:sz w:val="24"/>
-                <w:szCs w:val="24"/>
-              </w:rPr>
-              <w:t>2.知道攀爬的基本安全规则：排队等候、手抓牢脚踩实、前面的小朋友爬到位置再跟上，不推挤不催促。</w:t>
-            </w:r>
-          </w:p>
-          <w:p>
-            <w:pPr>
-              <w:rPr>
-                <w:rFonts w:ascii="宋体" w:hAnsi="宋体" w:cs="宋体"/>
-                <w:sz w:val="24"/>
-                <w:szCs w:val="24"/>
-              </w:rPr>
-            </w:pPr>
-            <w:r>
-              <w:rPr>
-                <w:rFonts w:ascii="宋体" w:hAnsi="宋体" w:cs="宋体" w:hint="eastAsia"/>
-                <w:sz w:val="24"/>
-                <w:szCs w:val="24"/>
-              </w:rPr>
-              <w:t>3.勇敢尝试有挑战性的攀爬路线，克服害怕心理，在完成挑战中获得自信心。</w:t>
-            </w:r>
-          </w:p>
-          <w:p>
-            <w:pPr>
-              <w:rPr>
-                <w:rFonts w:ascii="宋体" w:hAnsi="宋体" w:cs="宋体"/>
-                <w:sz w:val="24"/>
-                <w:szCs w:val="24"/>
-              </w:rPr>
-            </w:pPr>
-            <w:r>
-              <w:rPr>
-                <w:rFonts w:ascii="宋体" w:hAnsi="宋体" w:cs="宋体" w:hint="eastAsia"/>
-                <w:sz w:val="24"/>
-                <w:szCs w:val="24"/>
-              </w:rPr>
-              <w:t>材料： 大型攀爬架、攀爬网、软梯、绳梯、轮胎攀爬墙、木桩、安全地垫、安全规则图卡、闯关小贴纸等</w:t>
-            </w:r>
-          </w:p>
-          <w:p>
-            <w:pPr>
-              <w:rPr>
-                <w:rFonts w:ascii="宋体" w:hAnsi="宋体" w:cs="宋体"/>
-                <w:sz w:val="24"/>
-                <w:szCs w:val="24"/>
-              </w:rPr>
-            </w:pPr>
-            <w:r>
-              <w:rPr>
-                <w:rFonts w:ascii="宋体" w:hAnsi="宋体" w:cs="宋体" w:hint="eastAsia"/>
-                <w:sz w:val="24"/>
-                <w:szCs w:val="24"/>
-              </w:rPr>
-              <w:t>指导：</w:t>
-            </w:r>
-          </w:p>
-          <w:p>
-            <w:pPr>
-              <w:rPr>
-                <w:rFonts w:ascii="宋体" w:hAnsi="宋体" w:cs="宋体"/>
-                <w:sz w:val="24"/>
-                <w:szCs w:val="24"/>
-              </w:rPr>
-            </w:pPr>
-            <w:r>
-              <w:rPr>
-                <w:rFonts w:ascii="宋体" w:hAnsi="宋体" w:cs="宋体" w:hint="eastAsia"/>
-                <w:sz w:val="24"/>
-                <w:szCs w:val="24"/>
-              </w:rPr>
-              <w:t>1．游戏前带领幼儿认识攀爬区的材料和路线，示范讲解“手抓牢、脚踩实”的攀爬要领，师幼共同讨论攀爬安全规则，并用图示呈现在区域墙面上。</w:t>
-            </w:r>
-          </w:p>
-          <w:p>
-            <w:pPr>
-              <w:rPr>
-                <w:rFonts w:ascii="宋体" w:hAnsi="宋体" w:cs="宋体"/>
-                <w:sz w:val="24"/>
-                <w:szCs w:val="24"/>
-              </w:rPr>
-            </w:pPr>
-            <w:r>
-              <w:rPr>
-                <w:rFonts w:ascii="宋体" w:hAnsi="宋体" w:cs="宋体" w:hint="eastAsia"/>
-                <w:sz w:val="24"/>
-                <w:szCs w:val="24"/>
-              </w:rPr>
-              <w:t>2.游戏中重点观察幼儿攀爬情况，对能力较弱的幼儿给予鼓励和保护性帮助，引导能力强的幼儿挑战新路线，及时肯定幼儿的勇敢行为。</w:t>
-            </w:r>
-          </w:p>
-          <w:p>
-            <w:pPr>
-              <w:rPr>
-                <w:rFonts w:ascii="宋体" w:hAnsi="宋体" w:cs="宋体"/>
-                <w:sz w:val="24"/>
-                <w:szCs w:val="24"/>
-              </w:rPr>
-            </w:pPr>
-            <w:r>
-              <w:rPr>
-                <w:rFonts w:ascii="宋体" w:hAnsi="宋体" w:cs="宋体" w:hint="eastAsia"/>
-                <w:sz w:val="24"/>
-                <w:szCs w:val="24"/>
-              </w:rPr>
-              <w:t>3．游戏后组织幼儿分享攀爬经验和感受，讨论“遇到困难怎么办”，并将幼儿的攀爬照片布置在区域环境中，增强幼儿的自信心和成就感。</w:t>
             </w:r>
           </w:p>
         </w:tc>
@@ -1295,49 +1047,6 @@
                 <w:rFonts w:ascii="宋体" w:hAnsi="宋体" w:hint="eastAsia"/>
                 <w:sz w:val="24"/>
               </w:rPr>
-              <w:t>知道自己升中班了，有做中班小朋友的光荣感和自豪感，愿意接纳、关心新同伴。</w:t>
-            </w:r>
-          </w:p>
-          <w:p>
-            <w:pPr>
-              <w:pStyle w:val="a5"/>
-              <w:numPr>
-                <w:ilvl w:val="0"/>
-                <w:numId w:val="2"/>
-              </w:numPr>
-              <w:snapToGrid w:val="0"/>
-              <w:rPr>
-                <w:rFonts w:ascii="宋体" w:hAnsi="宋体"/>
-                <w:sz w:val="24"/>
-              </w:rPr>
-            </w:pPr>
-            <w:r>
-              <w:rPr>
-                <w:rFonts w:ascii="宋体" w:hAnsi="宋体" w:hint="eastAsia"/>
-                <w:sz w:val="24"/>
-              </w:rPr>
-              <w:t>能与同伴友好相处，共同游戏、活动和生活。</w:t>
-            </w:r>
-          </w:p>
-          <w:p>
-            <w:pPr>
-              <w:pStyle w:val="a5"/>
-              <w:numPr>
-                <w:ilvl w:val="0"/>
-                <w:numId w:val="2"/>
-              </w:numPr>
-              <w:snapToGrid w:val="0"/>
-              <w:rPr>
-                <w:rFonts w:ascii="宋体" w:hAnsi="宋体"/>
-                <w:sz w:val="24"/>
-              </w:rPr>
-            </w:pPr>
-            <w:r>
-              <w:rPr>
-                <w:rFonts w:ascii="宋体" w:hAnsi="宋体" w:hint="eastAsia"/>
-                <w:sz w:val="24"/>
-              </w:rPr>
-              <w:t>较大方地在集体面前清楚地表达自己的想法；有意识地听与自己有关的信息，安静倾听别人说话。</w:t>
             </w:r>
           </w:p>
         </w:tc>
@@ -1419,53 +1128,6 @@
                 <w:rFonts w:ascii="宋体" w:hAnsi="宋体" w:cs="宋体" w:hint="eastAsia"/>
                 <w:sz w:val="24"/>
               </w:rPr>
-              <w:t>1.创设新学期常规环境。</w:t>
-            </w:r>
-          </w:p>
-          <w:p>
-            <w:pPr>
-              <w:suppressAutoHyphens w:val="0"/>
-              <w:rPr>
-                <w:rFonts w:ascii="宋体" w:hAnsi="宋体" w:cs="宋体"/>
-                <w:sz w:val="24"/>
-              </w:rPr>
-            </w:pPr>
-            <w:r>
-              <w:rPr>
-                <w:rFonts w:ascii="宋体" w:hAnsi="宋体" w:cs="宋体" w:hint="eastAsia"/>
-                <w:sz w:val="24"/>
-              </w:rPr>
-              <w:t>2.创设与暑假生活相关的专栏，分别展出幼儿假期作品和游玩的照片。</w:t>
-            </w:r>
-          </w:p>
-          <w:p>
-            <w:pPr>
-              <w:rPr>
-                <w:rFonts w:ascii="宋体" w:hAnsi="宋体"/>
-                <w:color w:val="000000"/>
-                <w:sz w:val="24"/>
-              </w:rPr>
-            </w:pPr>
-            <w:r>
-              <w:rPr>
-                <w:rFonts w:ascii="宋体" w:hAnsi="宋体" w:cs="宋体" w:hint="eastAsia"/>
-                <w:sz w:val="24"/>
-              </w:rPr>
-              <w:t>3</w:t>
-            </w:r>
-            <w:r>
-              <w:rPr>
-                <w:rFonts w:ascii="宋体" w:hAnsi="宋体" w:cs="宋体"/>
-                <w:sz w:val="24"/>
-              </w:rPr>
-              <w:t>.</w:t>
-            </w:r>
-            <w:r>
-              <w:rPr>
-                <w:rFonts w:ascii="宋体" w:hAnsi="宋体" w:cs="宋体" w:hint="eastAsia"/>
-                <w:sz w:val="24"/>
-              </w:rPr>
-              <w:t>进一步美化自然角，帮助幼儿更好地感受新学期的气息。</w:t>
             </w:r>
           </w:p>
         </w:tc>
@@ -1564,37 +1226,6 @@
                 <w:rFonts w:ascii="宋体" w:hAnsi="宋体" w:hint="eastAsia"/>
                 <w:sz w:val="24"/>
               </w:rPr>
-              <w:t>卫生：引导幼儿重新熟悉幼儿园一日生活，重点加强幼儿七步洗手法的教育。</w:t>
-            </w:r>
-          </w:p>
-          <w:p>
-            <w:pPr>
-              <w:rPr>
-                <w:rFonts w:ascii="宋体" w:hAnsi="宋体"/>
-                <w:sz w:val="24"/>
-              </w:rPr>
-            </w:pPr>
-            <w:r>
-              <w:rPr>
-                <w:rFonts w:ascii="宋体" w:hAnsi="宋体" w:hint="eastAsia"/>
-                <w:sz w:val="24"/>
-              </w:rPr>
-              <w:t>午餐：午餐时保持桌面干净整洁，独立吃完自己的一份饭菜。</w:t>
-            </w:r>
-          </w:p>
-          <w:p>
-            <w:pPr>
-              <w:rPr>
-                <w:rFonts w:ascii="宋体" w:hAnsi="宋体"/>
-                <w:sz w:val="24"/>
-              </w:rPr>
-            </w:pPr>
-            <w:r>
-              <w:rPr>
-                <w:rFonts w:ascii="宋体" w:hAnsi="宋体" w:hint="eastAsia"/>
-                <w:sz w:val="24"/>
-              </w:rPr>
-              <w:t>午睡：午睡时保持安静，在成人的指导下，学会自己穿脱衣服。</w:t>
             </w:r>
           </w:p>
         </w:tc>
@@ -1677,13 +1308,16 @@
                 <w:sz w:val="24"/>
                 <w:szCs w:val="24"/>
               </w:rPr>
-              <w:t>支持和鼓励幼儿在家、在园做中班小朋友的愿望和积极性，并能给予一定的帮助和指导。</w:t>
             </w:r>
           </w:p>
         </w:tc>
       </w:tr>
     </w:tbl>
-    <w:p/>
+    <w:p>
+      <w:r>
+        <w:t xml:space="preserve"/>
+      </w:r>
+    </w:p>
     <w:p>
       <w:pPr>
         <w:jc w:val="center"/>
@@ -1703,8 +1337,7 @@
           <w:sz w:val="32"/>
           <w:szCs w:val="32"/>
         </w:rPr>
-        <w:lastRenderedPageBreak/>
-        <w:t>南通市崇川区樾府幼儿园每周工作计划表</w:t>
+        <w:t xml:space="preserve"/>
       </w:r>
     </w:p>
     <w:p>
@@ -1721,29 +1354,7 @@
           <w:sz w:val="24"/>
           <w:szCs w:val="24"/>
         </w:rPr>
-        <w:t>主题名称：《我是中班小朋友》 班级：中四班 第（二）周</w:t>
-      </w:r>
-      <w:r>
-        <w:rPr>
-          <w:rFonts w:ascii="宋体" w:hAnsi="宋体" w:cs="宋体" w:hint="eastAsia"/>
-          <w:sz w:val="24"/>
-        </w:rPr>
-        <w:t>（2026 年 9 月7日——9月</w:t>
-      </w:r>
-      <w:r>
-        <w:rPr>
-          <w:rFonts w:ascii="宋体" w:hAnsi="宋体" w:cs="宋体" w:hint="eastAsia"/>
-          <w:color w:val="000000"/>
-          <w:sz w:val="24"/>
-        </w:rPr>
-        <w:t>11日</w:t>
-      </w:r>
-      <w:r>
-        <w:rPr>
-          <w:rFonts w:ascii="宋体" w:hAnsi="宋体" w:cs="宋体" w:hint="eastAsia"/>
-          <w:sz w:val="24"/>
-        </w:rPr>
-        <w:t>）</w:t>
+        <w:t xml:space="preserve"/>
       </w:r>
     </w:p>
     <w:p>
@@ -1759,7 +1370,7 @@
           <w:rFonts w:ascii="宋体" w:hAnsi="宋体" w:cs="宋体" w:hint="eastAsia"/>
           <w:sz w:val="24"/>
         </w:rPr>
-        <w:t>教师： 戚甦甦 岳炜  保育员：朱维维</w:t>
+        <w:t xml:space="preserve"/>
       </w:r>
     </w:p>
     <w:tbl>
@@ -1832,6 +1443,7 @@
                 <w:szCs w:val="24"/>
               </w:rPr>
             </w:pPr>
+            <w:r/>
           </w:p>
         </w:tc>
         <w:tc>
@@ -2109,7 +1721,6 @@
                 <w:sz w:val="24"/>
                 <w:szCs w:val="24"/>
               </w:rPr>
-              <w:t>我的新本领</w:t>
             </w:r>
           </w:p>
         </w:tc>
@@ -2138,7 +1749,6 @@
                 <w:sz w:val="24"/>
                 <w:szCs w:val="24"/>
               </w:rPr>
-              <w:t>球球大发现</w:t>
             </w:r>
           </w:p>
         </w:tc>
@@ -2167,7 +1777,6 @@
                 <w:sz w:val="24"/>
                 <w:szCs w:val="24"/>
               </w:rPr>
-              <w:t>遇到新朋友</w:t>
             </w:r>
           </w:p>
         </w:tc>
@@ -2196,7 +1805,6 @@
                 <w:sz w:val="24"/>
                 <w:szCs w:val="24"/>
               </w:rPr>
-              <w:t>勇敢小卫士</w:t>
             </w:r>
           </w:p>
         </w:tc>
@@ -2225,7 +1833,6 @@
                 <w:sz w:val="24"/>
                 <w:szCs w:val="24"/>
               </w:rPr>
-              <w:t>牙齿保卫战</w:t>
             </w:r>
           </w:p>
         </w:tc>
@@ -2256,6 +1863,7 @@
                 <w:szCs w:val="24"/>
               </w:rPr>
             </w:pPr>
+            <w:r/>
           </w:p>
         </w:tc>
         <w:tc>
@@ -2330,7 +1938,6 @@
                 <w:sz w:val="24"/>
                 <w:szCs w:val="24"/>
               </w:rPr>
-              <w:t>语言：别说我小</w:t>
             </w:r>
           </w:p>
         </w:tc>
@@ -2359,7 +1966,6 @@
                 <w:sz w:val="24"/>
                 <w:szCs w:val="24"/>
               </w:rPr>
-              <w:t>科学：球与气</w:t>
             </w:r>
           </w:p>
         </w:tc>
@@ -2388,7 +1994,6 @@
                 <w:sz w:val="24"/>
                 <w:szCs w:val="24"/>
               </w:rPr>
-              <w:t>音乐：认识你呀真高兴</w:t>
             </w:r>
           </w:p>
         </w:tc>
@@ -2419,7 +2024,6 @@
                 <w:sz w:val="24"/>
                 <w:szCs w:val="24"/>
               </w:rPr>
-              <w:t>社会：胆小先生</w:t>
             </w:r>
           </w:p>
         </w:tc>
@@ -2450,7 +2054,6 @@
                 <w:sz w:val="24"/>
                 <w:szCs w:val="24"/>
               </w:rPr>
-              <w:t>健康：赶走蛀牙虫</w:t>
             </w:r>
           </w:p>
         </w:tc>
@@ -2581,43 +2184,6 @@
                 <w:sz w:val="24"/>
                 <w:szCs w:val="24"/>
               </w:rPr>
-              <w:t>体能大循环</w:t>
-            </w:r>
-          </w:p>
-          <w:p>
-            <w:pPr>
-              <w:spacing w:line="360" w:lineRule="exact"/>
-              <w:rPr>
-                <w:rFonts w:ascii="宋体" w:hAnsi="宋体" w:cs="宋体"/>
-                <w:sz w:val="24"/>
-                <w:szCs w:val="24"/>
-              </w:rPr>
-            </w:pPr>
-            <w:r>
-              <w:rPr>
-                <w:rFonts w:ascii="宋体" w:hAnsi="宋体" w:cs="宋体" w:hint="eastAsia"/>
-                <w:sz w:val="24"/>
-                <w:szCs w:val="24"/>
-              </w:rPr>
-              <w:t>集体游戏：1.《网小鱼》（目标：①练习四散追逐跑和躲闪跑，提高奔跑中的灵敏性和反应能力。②理解“渔网”合作围捕的游戏玩法，初步学习与同伴手拉手合作围捕小鱼。③体验“捕鱼”和“逃鱼”角色的紧张与刺激，能遵守“被捕小鱼安静等待”的规则，感受合作游戏的快乐。）2.《勇敢的小猎人》（目标：①练习肩上挥臂投掷，尝试投准2米左右的目标，发展上肢力量和手眼协调能力。②遵守游戏规则：站在线后投掷、听口令统一捡沙包，建立安全有序的活动秩序。③在投中“大灰狼”的挑战中体验成功的喜悦，增强自信心和不怕困难的品质。）</w:t>
-            </w:r>
-          </w:p>
-          <w:p>
-            <w:pPr>
-              <w:spacing w:line="360" w:lineRule="exact"/>
-              <w:rPr>
-                <w:rFonts w:ascii="宋体" w:hAnsi="宋体" w:cs="宋体"/>
-                <w:sz w:val="24"/>
-                <w:szCs w:val="24"/>
-              </w:rPr>
-            </w:pPr>
-            <w:r>
-              <w:rPr>
-                <w:rFonts w:ascii="宋体" w:hAnsi="宋体" w:cs="宋体" w:hint="eastAsia"/>
-                <w:sz w:val="24"/>
-                <w:szCs w:val="24"/>
-              </w:rPr>
-              <w:t>自主游戏：《花样玩球》（目标：①练习连续自抛自接球，初步掌握手眼协调一致的抛接球技能。②大胆探索皮球的一物多玩（滚球、抛接球、踢球），发展动作的灵活性和创造性。③不怕失败、坚持练习，在一次次尝试中体验进步的快乐，初步养成自主取放球类材料的习惯。）</w:t>
             </w:r>
           </w:p>
         </w:tc>
@@ -2649,6 +2215,7 @@
                 <w:szCs w:val="24"/>
               </w:rPr>
             </w:pPr>
+            <w:r/>
           </w:p>
         </w:tc>
         <w:tc>
@@ -2722,187 +2289,6 @@
                 <w:sz w:val="24"/>
                 <w:szCs w:val="24"/>
               </w:rPr>
-              <w:t>1.户外游戏 2.区域游戏 3.专用室</w:t>
-            </w:r>
-          </w:p>
-          <w:p>
-            <w:pPr>
-              <w:spacing w:line="360" w:lineRule="exact"/>
-              <w:rPr>
-                <w:rFonts w:ascii="宋体" w:hAnsi="宋体" w:cs="宋体"/>
-                <w:sz w:val="24"/>
-                <w:szCs w:val="24"/>
-              </w:rPr>
-            </w:pPr>
-            <w:r>
-              <w:rPr>
-                <w:rFonts w:ascii="宋体" w:hAnsi="宋体" w:cs="宋体" w:hint="eastAsia"/>
-                <w:sz w:val="24"/>
-                <w:szCs w:val="24"/>
-              </w:rPr>
-              <w:t>本周重点指导区域：蜜雪冰城</w:t>
-            </w:r>
-          </w:p>
-          <w:p>
-            <w:pPr>
-              <w:spacing w:line="360" w:lineRule="exact"/>
-              <w:rPr>
-                <w:rFonts w:ascii="宋体" w:hAnsi="宋体" w:cs="宋体"/>
-                <w:sz w:val="24"/>
-                <w:szCs w:val="24"/>
-              </w:rPr>
-            </w:pPr>
-            <w:r>
-              <w:rPr>
-                <w:rFonts w:ascii="宋体" w:hAnsi="宋体" w:cs="宋体" w:hint="eastAsia"/>
-                <w:sz w:val="24"/>
-                <w:szCs w:val="24"/>
-              </w:rPr>
-              <w:t>目标：</w:t>
-            </w:r>
-          </w:p>
-          <w:p>
-            <w:pPr>
-              <w:spacing w:line="360" w:lineRule="exact"/>
-              <w:rPr>
-                <w:rFonts w:ascii="宋体" w:hAnsi="宋体" w:cs="宋体"/>
-                <w:sz w:val="24"/>
-                <w:szCs w:val="24"/>
-              </w:rPr>
-            </w:pPr>
-            <w:r>
-              <w:rPr>
-                <w:rFonts w:ascii="宋体" w:hAnsi="宋体" w:cs="宋体" w:hint="eastAsia"/>
-                <w:sz w:val="24"/>
-                <w:szCs w:val="24"/>
-              </w:rPr>
-              <w:t>1.了解蜜雪冰城中收银员、服务员、顾客等角色的职责，能使用“欢迎光临”“请问需要什么”“谢谢”等礼貌用语进行交往。</w:t>
-            </w:r>
-          </w:p>
-          <w:p>
-            <w:pPr>
-              <w:spacing w:line="360" w:lineRule="exact"/>
-              <w:rPr>
-                <w:rFonts w:ascii="宋体" w:hAnsi="宋体" w:cs="宋体"/>
-                <w:sz w:val="24"/>
-                <w:szCs w:val="24"/>
-              </w:rPr>
-            </w:pPr>
-            <w:r>
-              <w:rPr>
-                <w:rFonts w:ascii="宋体" w:hAnsi="宋体" w:cs="宋体" w:hint="eastAsia"/>
-                <w:sz w:val="24"/>
-                <w:szCs w:val="24"/>
-              </w:rPr>
-              <w:t>2.能围绕“点单—制作—购买”的情节展开角色对话，发展语言表达能力和同伴交往能力。</w:t>
-            </w:r>
-          </w:p>
-          <w:p>
-            <w:pPr>
-              <w:spacing w:line="360" w:lineRule="exact"/>
-              <w:rPr>
-                <w:rFonts w:ascii="宋体" w:hAnsi="宋体" w:cs="宋体"/>
-                <w:sz w:val="24"/>
-                <w:szCs w:val="24"/>
-              </w:rPr>
-            </w:pPr>
-            <w:r>
-              <w:rPr>
-                <w:rFonts w:ascii="宋体" w:hAnsi="宋体" w:cs="宋体" w:hint="eastAsia"/>
-                <w:sz w:val="24"/>
-                <w:szCs w:val="24"/>
-              </w:rPr>
-              <w:t>3.学会正确使用游戏材料，游戏结束后能按标记分类整理归位。</w:t>
-            </w:r>
-          </w:p>
-          <w:p>
-            <w:pPr>
-              <w:spacing w:line="360" w:lineRule="exact"/>
-              <w:rPr>
-                <w:rFonts w:ascii="宋体" w:hAnsi="宋体" w:cs="宋体"/>
-                <w:sz w:val="24"/>
-                <w:szCs w:val="24"/>
-              </w:rPr>
-            </w:pPr>
-            <w:r>
-              <w:rPr>
-                <w:rFonts w:ascii="宋体" w:hAnsi="宋体" w:cs="宋体" w:hint="eastAsia"/>
-                <w:sz w:val="24"/>
-                <w:szCs w:val="24"/>
-              </w:rPr>
-              <w:t>材料： 收银台、玩具收银机、菜单价目表、自制冰淇淋和奶茶杯、吸管、纸杯等</w:t>
-            </w:r>
-          </w:p>
-          <w:p>
-            <w:pPr>
-              <w:spacing w:line="360" w:lineRule="exact"/>
-              <w:rPr>
-                <w:rFonts w:ascii="宋体" w:hAnsi="宋体" w:cs="宋体"/>
-                <w:sz w:val="24"/>
-                <w:szCs w:val="24"/>
-              </w:rPr>
-            </w:pPr>
-            <w:r>
-              <w:rPr>
-                <w:rFonts w:ascii="宋体" w:hAnsi="宋体" w:cs="宋体" w:hint="eastAsia"/>
-                <w:sz w:val="24"/>
-                <w:szCs w:val="24"/>
-              </w:rPr>
-              <w:t>指导：</w:t>
-            </w:r>
-          </w:p>
-          <w:p>
-            <w:pPr>
-              <w:spacing w:line="360" w:lineRule="exact"/>
-              <w:rPr>
-                <w:rFonts w:ascii="宋体" w:hAnsi="宋体" w:cs="宋体"/>
-                <w:sz w:val="24"/>
-                <w:szCs w:val="24"/>
-              </w:rPr>
-            </w:pPr>
-            <w:r>
-              <w:rPr>
-                <w:rFonts w:ascii="宋体" w:hAnsi="宋体" w:cs="宋体" w:hint="eastAsia"/>
-                <w:sz w:val="24"/>
-                <w:szCs w:val="24"/>
-              </w:rPr>
-              <w:t>1.游戏前通过谈话和门店照片唤醒已有经验，帮助幼儿明确角色分工与游戏情节。</w:t>
-            </w:r>
-          </w:p>
-          <w:p>
-            <w:pPr>
-              <w:spacing w:line="360" w:lineRule="exact"/>
-              <w:rPr>
-                <w:rFonts w:ascii="宋体" w:hAnsi="宋体" w:cs="宋体"/>
-                <w:sz w:val="24"/>
-                <w:szCs w:val="24"/>
-              </w:rPr>
-            </w:pPr>
-            <w:r>
-              <w:rPr>
-                <w:rFonts w:ascii="宋体" w:hAnsi="宋体" w:cs="宋体" w:hint="eastAsia"/>
-                <w:sz w:val="24"/>
-                <w:szCs w:val="24"/>
-              </w:rPr>
-              <w:t>2.游戏中以“顾客”身份自然介入指导，示范点单、付钱、道谢等交往语言。</w:t>
-            </w:r>
-          </w:p>
-          <w:p>
-            <w:pPr>
-              <w:spacing w:line="360" w:lineRule="exact"/>
-              <w:rPr>
-                <w:rFonts w:ascii="宋体" w:hAnsi="宋体" w:cs="宋体"/>
-                <w:sz w:val="24"/>
-                <w:szCs w:val="24"/>
-              </w:rPr>
-            </w:pPr>
-            <w:r>
-              <w:rPr>
-                <w:rFonts w:ascii="宋体" w:hAnsi="宋体" w:cs="宋体" w:hint="eastAsia"/>
-                <w:sz w:val="24"/>
-                <w:szCs w:val="24"/>
-              </w:rPr>
-              <w:t>3.游戏结束组织分享交流，针对材料乱放的问题引导幼儿建立按标记分类整理规则。</w:t>
             </w:r>
           </w:p>
         </w:tc>
@@ -2991,53 +2377,6 @@
                 <w:sz w:val="24"/>
                 <w:szCs w:val="24"/>
               </w:rPr>
-              <w:t>能够点数出10以内的实物数量并说出总数；会用不同的方法对5以内的多种实物进行大小或长短排序。</w:t>
-            </w:r>
-          </w:p>
-          <w:p>
-            <w:pPr>
-              <w:pStyle w:val="a5"/>
-              <w:numPr>
-                <w:ilvl w:val="0"/>
-                <w:numId w:val="1"/>
-              </w:numPr>
-              <w:spacing w:line="360" w:lineRule="exact"/>
-              <w:rPr>
-                <w:rFonts w:ascii="宋体" w:hAnsi="宋体" w:cs="宋体"/>
-                <w:sz w:val="24"/>
-                <w:szCs w:val="24"/>
-              </w:rPr>
-            </w:pPr>
-            <w:r>
-              <w:rPr>
-                <w:rFonts w:ascii="宋体" w:hAnsi="宋体" w:cs="宋体" w:hint="eastAsia"/>
-                <w:sz w:val="24"/>
-                <w:szCs w:val="24"/>
-              </w:rPr>
-              <w:t>能够用音量适中的声音演唱，喜欢参与韵律活动，并能随音乐合拍地做动作。</w:t>
-            </w:r>
-          </w:p>
-          <w:p>
-            <w:pPr>
-              <w:pStyle w:val="a5"/>
-              <w:numPr>
-                <w:ilvl w:val="0"/>
-                <w:numId w:val="1"/>
-              </w:numPr>
-              <w:spacing w:line="360" w:lineRule="exact"/>
-              <w:rPr>
-                <w:rFonts w:ascii="宋体" w:hAnsi="宋体" w:cs="宋体"/>
-                <w:sz w:val="24"/>
-                <w:szCs w:val="24"/>
-              </w:rPr>
-            </w:pPr>
-            <w:r>
-              <w:rPr>
-                <w:rFonts w:ascii="宋体" w:hAnsi="宋体" w:cs="宋体" w:hint="eastAsia"/>
-                <w:sz w:val="24"/>
-                <w:szCs w:val="24"/>
-              </w:rPr>
-              <w:t>能画出人物的主要特征，并能关注脸部细节；学习正确使用水彩笔。</w:t>
             </w:r>
           </w:p>
         </w:tc>
@@ -3121,42 +2460,6 @@
                 <w:sz w:val="24"/>
                 <w:szCs w:val="24"/>
               </w:rPr>
-              <w:t>1.创设“好朋友”园地，将好朋友照片剪下来贴在园地里，并不断丰富内容。</w:t>
-            </w:r>
-          </w:p>
-          <w:p>
-            <w:pPr>
-              <w:jc w:val="left"/>
-              <w:rPr>
-                <w:rFonts w:ascii="宋体" w:hAnsi="宋体"/>
-                <w:sz w:val="24"/>
-                <w:szCs w:val="24"/>
-              </w:rPr>
-            </w:pPr>
-            <w:r>
-              <w:rPr>
-                <w:rFonts w:ascii="宋体" w:hAnsi="宋体" w:hint="eastAsia"/>
-                <w:sz w:val="24"/>
-                <w:szCs w:val="24"/>
-              </w:rPr>
-              <w:t>2.创设“秋天多美丽”自然角，让幼儿观察秋天，了解秋天。</w:t>
-            </w:r>
-          </w:p>
-          <w:p>
-            <w:pPr>
-              <w:rPr>
-                <w:rFonts w:ascii="宋体" w:hAnsi="宋体" w:cs="宋体"/>
-                <w:sz w:val="24"/>
-                <w:szCs w:val="24"/>
-              </w:rPr>
-            </w:pPr>
-            <w:r>
-              <w:rPr>
-                <w:rFonts w:ascii="宋体" w:hAnsi="宋体" w:hint="eastAsia"/>
-                <w:sz w:val="24"/>
-                <w:szCs w:val="24"/>
-              </w:rPr>
-              <w:t>3.在语言区投放故事挂图和角色头饰，支持幼儿分角色讲述故事。</w:t>
             </w:r>
           </w:p>
         </w:tc>
@@ -3258,42 +2561,6 @@
                 <w:sz w:val="24"/>
                 <w:szCs w:val="24"/>
               </w:rPr>
-              <w:t>卫生：复习七步洗手法，咳嗽、打喷嚏时会遮挡口鼻，进一步增强自我保护意识。</w:t>
-            </w:r>
-          </w:p>
-          <w:p>
-            <w:pPr>
-              <w:jc w:val="left"/>
-              <w:rPr>
-                <w:rFonts w:ascii="宋体" w:hAnsi="宋体"/>
-                <w:sz w:val="24"/>
-                <w:szCs w:val="24"/>
-              </w:rPr>
-            </w:pPr>
-            <w:r>
-              <w:rPr>
-                <w:rFonts w:ascii="宋体" w:hAnsi="宋体" w:hint="eastAsia"/>
-                <w:sz w:val="24"/>
-                <w:szCs w:val="24"/>
-              </w:rPr>
-              <w:t>午餐：愉快的进餐，基本上能独立吃完自己的一份饭菜，保持桌面、地面、身上的整洁。</w:t>
-            </w:r>
-          </w:p>
-          <w:p>
-            <w:pPr>
-              <w:rPr>
-                <w:rFonts w:ascii="宋体" w:hAnsi="宋体" w:cs="宋体"/>
-                <w:sz w:val="24"/>
-                <w:szCs w:val="24"/>
-              </w:rPr>
-            </w:pPr>
-            <w:r>
-              <w:rPr>
-                <w:rFonts w:ascii="宋体" w:hAnsi="宋体" w:hint="eastAsia"/>
-                <w:sz w:val="24"/>
-                <w:szCs w:val="24"/>
-              </w:rPr>
-              <w:t>午睡：继续了解正确穿脱衣服的简单方法，并能安静就寝。</w:t>
             </w:r>
           </w:p>
         </w:tc>
@@ -3377,7 +2644,6 @@
                 <w:sz w:val="24"/>
                 <w:szCs w:val="24"/>
               </w:rPr>
-              <w:t>督促幼儿在家坚持早晚用正确的方法刷牙。</w:t>
             </w:r>
           </w:p>
         </w:tc>
@@ -3402,18 +2668,7 @@
           <w:sz w:val="32"/>
           <w:szCs w:val="32"/>
         </w:rPr>
-        <w:br w:type="page"/>
-      </w:r>
-      <w:r>
-        <w:rPr>
-          <w:rFonts w:ascii="宋体" w:hAnsi="宋体" w:cs="宋体" w:hint="eastAsia"/>
-          <w:b/>
-          <w:bCs/>
-          <w:sz w:val="32"/>
-          <w:szCs w:val="32"/>
-        </w:rPr>
-        <w:lastRenderedPageBreak/>
-        <w:t>南通市崇川区樾府幼儿园每周工作计划表</w:t>
+        <w:t xml:space="preserve"/>
       </w:r>
     </w:p>
     <w:p>
@@ -3430,29 +2685,7 @@
           <w:sz w:val="24"/>
           <w:szCs w:val="24"/>
         </w:rPr>
-        <w:t>主题名称：《我是中班小朋友》 班级：中四班 第（三）周</w:t>
-      </w:r>
-      <w:r>
-        <w:rPr>
-          <w:rFonts w:ascii="宋体" w:hAnsi="宋体" w:cs="宋体" w:hint="eastAsia"/>
-          <w:sz w:val="24"/>
-        </w:rPr>
-        <w:t>（2026 年 9 月14日——9月</w:t>
-      </w:r>
-      <w:r>
-        <w:rPr>
-          <w:rFonts w:ascii="宋体" w:hAnsi="宋体" w:cs="宋体" w:hint="eastAsia"/>
-          <w:color w:val="000000"/>
-          <w:sz w:val="24"/>
-        </w:rPr>
-        <w:t>18日</w:t>
-      </w:r>
-      <w:r>
-        <w:rPr>
-          <w:rFonts w:ascii="宋体" w:hAnsi="宋体" w:cs="宋体" w:hint="eastAsia"/>
-          <w:sz w:val="24"/>
-        </w:rPr>
-        <w:t>）</w:t>
+        <w:t xml:space="preserve"/>
       </w:r>
     </w:p>
     <w:p>
@@ -3468,7 +2701,7 @@
           <w:rFonts w:ascii="宋体" w:hAnsi="宋体" w:cs="宋体" w:hint="eastAsia"/>
           <w:sz w:val="24"/>
         </w:rPr>
-        <w:t>教师： 戚甦甦 岳炜  保育员：朱维维</w:t>
+        <w:t xml:space="preserve"/>
       </w:r>
     </w:p>
     <w:tbl>
@@ -3541,6 +2774,7 @@
                 <w:szCs w:val="24"/>
               </w:rPr>
             </w:pPr>
+            <w:r/>
           </w:p>
         </w:tc>
         <w:tc>
@@ -3818,7 +3052,6 @@
                 <w:sz w:val="24"/>
                 <w:szCs w:val="24"/>
               </w:rPr>
-              <w:t>今天我值日</w:t>
             </w:r>
           </w:p>
         </w:tc>
@@ -3847,7 +3080,6 @@
                 <w:sz w:val="24"/>
                 <w:szCs w:val="24"/>
               </w:rPr>
-              <w:t>秋天的发现</w:t>
             </w:r>
           </w:p>
         </w:tc>
@@ -3876,7 +3108,6 @@
                 <w:sz w:val="24"/>
                 <w:szCs w:val="24"/>
               </w:rPr>
-              <w:t>我的小巧手</w:t>
             </w:r>
           </w:p>
         </w:tc>
@@ -3905,7 +3136,6 @@
                 <w:sz w:val="24"/>
                 <w:szCs w:val="24"/>
               </w:rPr>
-              <w:t>我会保护自己</w:t>
             </w:r>
           </w:p>
         </w:tc>
@@ -3934,7 +3164,6 @@
                 <w:sz w:val="24"/>
                 <w:szCs w:val="24"/>
               </w:rPr>
-              <w:t>我爱五星红旗</w:t>
             </w:r>
           </w:p>
         </w:tc>
@@ -3965,6 +3194,7 @@
                 <w:szCs w:val="24"/>
               </w:rPr>
             </w:pPr>
+            <w:r/>
           </w:p>
         </w:tc>
         <w:tc>
@@ -4039,7 +3269,6 @@
                 <w:sz w:val="24"/>
                 <w:szCs w:val="24"/>
               </w:rPr>
-              <w:t>语言：小小值日生</w:t>
             </w:r>
           </w:p>
         </w:tc>
@@ -4068,7 +3297,6 @@
                 <w:sz w:val="24"/>
                 <w:szCs w:val="24"/>
               </w:rPr>
-              <w:t>社会：我是班级小主人</w:t>
             </w:r>
           </w:p>
         </w:tc>
@@ -4097,7 +3325,6 @@
                 <w:sz w:val="24"/>
                 <w:szCs w:val="24"/>
               </w:rPr>
-              <w:t>艺术：老师的手真巧</w:t>
             </w:r>
           </w:p>
         </w:tc>
@@ -4126,7 +3353,6 @@
                 <w:sz w:val="24"/>
                 <w:szCs w:val="24"/>
               </w:rPr>
-              <w:t>社会：我一个人在家</w:t>
             </w:r>
           </w:p>
         </w:tc>
@@ -4155,7 +3381,6 @@
                 <w:sz w:val="24"/>
                 <w:szCs w:val="24"/>
               </w:rPr>
-              <w:t>健康：纪念九一八事变</w:t>
             </w:r>
           </w:p>
         </w:tc>
@@ -4288,7 +3513,6 @@
                 <w:sz w:val="24"/>
                 <w:szCs w:val="24"/>
               </w:rPr>
-              <w:t>体能大循环集体游戏：1.《小兔跳跳跳》（目标：①练习双脚并拢向前连续跳，并能按“草地”“小河”的信号变换跳跃方向和节奏，发展下肢力量和身体协调性。②遵守“排队轮流跳、落地轻轻不推挤”的游戏规则，初步学会在跳跃中避让同伴、保护自己。③在小兔采蘑菇的游戏情境中体验跳跃运动的快乐，愿意做勇敢、守规则的小兔子。）2.《彩虹伞》（目标：①练习听信号协同拉伞、抖伞、举伞、钻伞，发展手臂力量和动作的协调性。②感受全班共同操控一把大伞需要一起用力、听统一口令，初步学习与同伴合作完成任务。③在大伞忽高忽低、变成“大蛋糕”“蒙古包”的变化中体验集体合作游戏的乐趣。）自主游戏：《平衡木探险》（目标：①练习在平衡木上两臂侧平举、平稳行走，发展平衡能力和身体控制能力。②能自主选择高低、宽窄不同的平衡木大胆尝试，手脚协调地通过“小桥”。③勇敢接受挑战，游戏结束后能主动把器材送回原位，养成收拾整理的习惯。）</w:t>
             </w:r>
           </w:p>
         </w:tc>
@@ -4320,6 +3544,7 @@
                 <w:szCs w:val="24"/>
               </w:rPr>
             </w:pPr>
+            <w:r/>
           </w:p>
         </w:tc>
         <w:tc>
@@ -4395,187 +3620,6 @@
                 <w:sz w:val="24"/>
                 <w:szCs w:val="24"/>
               </w:rPr>
-              <w:t>户外游戏 2.区域游戏 3.专用室</w:t>
-            </w:r>
-          </w:p>
-          <w:p>
-            <w:pPr>
-              <w:spacing w:line="300" w:lineRule="exact"/>
-              <w:rPr>
-                <w:rFonts w:ascii="宋体" w:hAnsi="宋体" w:cs="宋体"/>
-                <w:sz w:val="24"/>
-                <w:szCs w:val="24"/>
-              </w:rPr>
-            </w:pPr>
-            <w:r>
-              <w:rPr>
-                <w:rFonts w:ascii="宋体" w:hAnsi="宋体" w:cs="宋体" w:hint="eastAsia"/>
-                <w:sz w:val="24"/>
-                <w:szCs w:val="24"/>
-              </w:rPr>
-              <w:t>本周重点指导区域：美工区</w:t>
-            </w:r>
-          </w:p>
-          <w:p>
-            <w:pPr>
-              <w:spacing w:line="300" w:lineRule="exact"/>
-              <w:rPr>
-                <w:rFonts w:ascii="宋体" w:hAnsi="宋体" w:cs="宋体"/>
-                <w:sz w:val="24"/>
-                <w:szCs w:val="24"/>
-              </w:rPr>
-            </w:pPr>
-            <w:r>
-              <w:rPr>
-                <w:rFonts w:ascii="宋体" w:hAnsi="宋体" w:cs="宋体" w:hint="eastAsia"/>
-                <w:sz w:val="24"/>
-                <w:szCs w:val="24"/>
-              </w:rPr>
-              <w:t>目标：</w:t>
-            </w:r>
-          </w:p>
-          <w:p>
-            <w:pPr>
-              <w:spacing w:line="300" w:lineRule="exact"/>
-              <w:rPr>
-                <w:rFonts w:ascii="宋体" w:hAnsi="宋体" w:cs="宋体"/>
-                <w:sz w:val="24"/>
-                <w:szCs w:val="24"/>
-              </w:rPr>
-            </w:pPr>
-            <w:r>
-              <w:rPr>
-                <w:rFonts w:ascii="宋体" w:hAnsi="宋体" w:cs="宋体" w:hint="eastAsia"/>
-                <w:sz w:val="24"/>
-                <w:szCs w:val="24"/>
-              </w:rPr>
-              <w:t>1.学习用画、剪、贴、捏等方式表现“我会做的事”和秋天的发现，发展手部精细动作和手眼协调能力。</w:t>
-            </w:r>
-          </w:p>
-          <w:p>
-            <w:pPr>
-              <w:spacing w:line="300" w:lineRule="exact"/>
-              <w:rPr>
-                <w:rFonts w:ascii="宋体" w:hAnsi="宋体" w:cs="宋体"/>
-                <w:sz w:val="24"/>
-                <w:szCs w:val="24"/>
-              </w:rPr>
-            </w:pPr>
-            <w:r>
-              <w:rPr>
-                <w:rFonts w:ascii="宋体" w:hAnsi="宋体" w:cs="宋体" w:hint="eastAsia"/>
-                <w:sz w:val="24"/>
-                <w:szCs w:val="24"/>
-              </w:rPr>
-              <w:t>2.能自主选择彩纸、黏土、自然物等材料，有目的地完成作品，并大胆向同伴介绍自己的作品。</w:t>
-            </w:r>
-          </w:p>
-          <w:p>
-            <w:pPr>
-              <w:spacing w:line="300" w:lineRule="exact"/>
-              <w:rPr>
-                <w:rFonts w:ascii="宋体" w:hAnsi="宋体" w:cs="宋体"/>
-                <w:sz w:val="24"/>
-                <w:szCs w:val="24"/>
-              </w:rPr>
-            </w:pPr>
-            <w:r>
-              <w:rPr>
-                <w:rFonts w:ascii="宋体" w:hAnsi="宋体" w:cs="宋体" w:hint="eastAsia"/>
-                <w:sz w:val="24"/>
-                <w:szCs w:val="24"/>
-              </w:rPr>
-              <w:t>3.学习与同伴协商共用材料，工具用后放回原处，保持桌面和地面整洁。</w:t>
-            </w:r>
-          </w:p>
-          <w:p>
-            <w:pPr>
-              <w:spacing w:line="300" w:lineRule="exact"/>
-              <w:rPr>
-                <w:rFonts w:ascii="宋体" w:hAnsi="宋体" w:cs="宋体"/>
-                <w:sz w:val="24"/>
-                <w:szCs w:val="24"/>
-              </w:rPr>
-            </w:pPr>
-            <w:r>
-              <w:rPr>
-                <w:rFonts w:ascii="宋体" w:hAnsi="宋体" w:cs="宋体" w:hint="eastAsia"/>
-                <w:sz w:val="24"/>
-                <w:szCs w:val="24"/>
-              </w:rPr>
-              <w:t>材料： 画纸、水彩笔、油画棒、彩纸、安全剪刀、胶棒、超轻黏土、秋天的树叶、树枝、松果、值日生袖章、“小巧手”作品展示板等。</w:t>
-            </w:r>
-          </w:p>
-          <w:p>
-            <w:pPr>
-              <w:spacing w:line="300" w:lineRule="exact"/>
-              <w:rPr>
-                <w:rFonts w:ascii="宋体" w:hAnsi="宋体" w:cs="宋体"/>
-                <w:sz w:val="24"/>
-                <w:szCs w:val="24"/>
-              </w:rPr>
-            </w:pPr>
-            <w:r>
-              <w:rPr>
-                <w:rFonts w:ascii="宋体" w:hAnsi="宋体" w:cs="宋体" w:hint="eastAsia"/>
-                <w:sz w:val="24"/>
-                <w:szCs w:val="24"/>
-              </w:rPr>
-              <w:t>指导：</w:t>
-            </w:r>
-          </w:p>
-          <w:p>
-            <w:pPr>
-              <w:spacing w:line="300" w:lineRule="exact"/>
-              <w:rPr>
-                <w:rFonts w:ascii="宋体" w:hAnsi="宋体" w:cs="宋体"/>
-                <w:sz w:val="24"/>
-                <w:szCs w:val="24"/>
-              </w:rPr>
-            </w:pPr>
-            <w:r>
-              <w:rPr>
-                <w:rFonts w:ascii="宋体" w:hAnsi="宋体" w:cs="宋体" w:hint="eastAsia"/>
-                <w:sz w:val="24"/>
-                <w:szCs w:val="24"/>
-              </w:rPr>
-              <w:t>1．游戏前结合“老师的手真巧”和值日生话题，和幼儿讨论“我们的小巧手能为班级做什么”，支持幼儿把想做的事画下来、做出来。</w:t>
-            </w:r>
-          </w:p>
-          <w:p>
-            <w:pPr>
-              <w:spacing w:line="300" w:lineRule="exact"/>
-              <w:rPr>
-                <w:rFonts w:ascii="宋体" w:hAnsi="宋体" w:cs="宋体"/>
-                <w:sz w:val="24"/>
-                <w:szCs w:val="24"/>
-              </w:rPr>
-            </w:pPr>
-            <w:r>
-              <w:rPr>
-                <w:rFonts w:ascii="宋体" w:hAnsi="宋体" w:cs="宋体" w:hint="eastAsia"/>
-                <w:sz w:val="24"/>
-                <w:szCs w:val="24"/>
-              </w:rPr>
-              <w:t>2.游戏中观察幼儿使用剪刀、胶棒和自然材料的情况，对动手能力较弱的幼儿示范基本的剪、贴、捏动作，鼓励能力强的幼儿为作品添画细节、合作完成大件作品。</w:t>
-            </w:r>
-          </w:p>
-          <w:p>
-            <w:pPr>
-              <w:spacing w:line="300" w:lineRule="exact"/>
-              <w:rPr>
-                <w:rFonts w:ascii="宋体" w:hAnsi="宋体" w:cs="宋体"/>
-                <w:sz w:val="24"/>
-                <w:szCs w:val="24"/>
-              </w:rPr>
-            </w:pPr>
-            <w:r>
-              <w:rPr>
-                <w:rFonts w:ascii="宋体" w:hAnsi="宋体" w:cs="宋体" w:hint="eastAsia"/>
-                <w:sz w:val="24"/>
-                <w:szCs w:val="24"/>
-              </w:rPr>
-              <w:t>3．游戏后布置“小巧手作品展”，引导幼儿介绍自己的作品，并按标记把工具和材料分类收拾归位。</w:t>
             </w:r>
           </w:p>
         </w:tc>
@@ -4664,53 +3708,6 @@
                 <w:sz w:val="24"/>
                 <w:szCs w:val="24"/>
               </w:rPr>
-              <w:t>知道自己是班级的小主人，了解班级小岗位的职责，愿意为集体和同伴做力所能及的事。</w:t>
-            </w:r>
-          </w:p>
-          <w:p>
-            <w:pPr>
-              <w:pStyle w:val="a5"/>
-              <w:numPr>
-                <w:ilvl w:val="0"/>
-                <w:numId w:val="6"/>
-              </w:numPr>
-              <w:spacing w:line="300" w:lineRule="exact"/>
-              <w:rPr>
-                <w:rFonts w:ascii="宋体" w:hAnsi="宋体" w:cs="宋体"/>
-                <w:sz w:val="24"/>
-                <w:szCs w:val="24"/>
-              </w:rPr>
-            </w:pPr>
-            <w:r>
-              <w:rPr>
-                <w:rFonts w:ascii="宋体" w:hAnsi="宋体" w:cs="宋体" w:hint="eastAsia"/>
-                <w:sz w:val="24"/>
-                <w:szCs w:val="24"/>
-              </w:rPr>
-              <w:t>学习用画、剪、贴等方式表现自己会做的事，发展手部动作。</w:t>
-            </w:r>
-          </w:p>
-          <w:p>
-            <w:pPr>
-              <w:pStyle w:val="a5"/>
-              <w:numPr>
-                <w:ilvl w:val="0"/>
-                <w:numId w:val="6"/>
-              </w:numPr>
-              <w:spacing w:line="300" w:lineRule="exact"/>
-              <w:rPr>
-                <w:rFonts w:ascii="宋体" w:hAnsi="宋体" w:cs="宋体"/>
-                <w:sz w:val="24"/>
-                <w:szCs w:val="24"/>
-              </w:rPr>
-            </w:pPr>
-            <w:r>
-              <w:rPr>
-                <w:rFonts w:ascii="宋体" w:hAnsi="宋体" w:cs="宋体" w:hint="eastAsia"/>
-                <w:sz w:val="24"/>
-                <w:szCs w:val="24"/>
-              </w:rPr>
-              <w:t>关注秋天的变化，愿意观察和表达。</w:t>
             </w:r>
           </w:p>
         </w:tc>
@@ -4794,43 +3791,6 @@
                 <w:sz w:val="24"/>
                 <w:szCs w:val="24"/>
               </w:rPr>
-              <w:t>1.创设“班级小主人”值日生专栏，张贴值日生分工图和轮岗表。</w:t>
-            </w:r>
-          </w:p>
-          <w:p>
-            <w:pPr>
-              <w:spacing w:line="300" w:lineRule="exact"/>
-              <w:rPr>
-                <w:rFonts w:ascii="宋体" w:hAnsi="宋体" w:cs="宋体"/>
-                <w:sz w:val="24"/>
-                <w:szCs w:val="24"/>
-              </w:rPr>
-            </w:pPr>
-            <w:r>
-              <w:rPr>
-                <w:rFonts w:ascii="宋体" w:hAnsi="宋体" w:cs="宋体" w:hint="eastAsia"/>
-                <w:sz w:val="24"/>
-                <w:szCs w:val="24"/>
-              </w:rPr>
-              <w:t>2.丰富“秋天多美丽”自然角，投放秋天的果实、种子，引导幼儿观察、讲述秋天的变化。</w:t>
-            </w:r>
-          </w:p>
-          <w:p>
-            <w:pPr>
-              <w:spacing w:line="300" w:lineRule="exact"/>
-              <w:rPr>
-                <w:rFonts w:ascii="宋体" w:hAnsi="宋体" w:cs="宋体"/>
-                <w:sz w:val="24"/>
-                <w:szCs w:val="24"/>
-              </w:rPr>
-            </w:pPr>
-            <w:r>
-              <w:rPr>
-                <w:rFonts w:ascii="宋体" w:hAnsi="宋体" w:cs="宋体" w:hint="eastAsia"/>
-                <w:sz w:val="24"/>
-                <w:szCs w:val="24"/>
-              </w:rPr>
-              <w:t>3.布置“小巧手”作品展示墙，展出幼儿为班级、为同伴制作的绘画和手工作品。</w:t>
             </w:r>
           </w:p>
         </w:tc>
@@ -4932,43 +3892,6 @@
                 <w:sz w:val="24"/>
                 <w:szCs w:val="24"/>
               </w:rPr>
-              <w:t>卫生：坚持用七步洗手法洗手，咳嗽、打喷嚏时主动遮挡口鼻。</w:t>
-            </w:r>
-          </w:p>
-          <w:p>
-            <w:pPr>
-              <w:spacing w:line="300" w:lineRule="exact"/>
-              <w:rPr>
-                <w:rFonts w:ascii="宋体" w:hAnsi="宋体" w:cs="宋体"/>
-                <w:sz w:val="24"/>
-                <w:szCs w:val="24"/>
-              </w:rPr>
-            </w:pPr>
-            <w:r>
-              <w:rPr>
-                <w:rFonts w:ascii="宋体" w:hAnsi="宋体" w:cs="宋体" w:hint="eastAsia"/>
-                <w:sz w:val="24"/>
-                <w:szCs w:val="24"/>
-              </w:rPr>
-              <w:t>午餐：愉快安静地进餐，独立吃完自己的一份饭菜，保持桌面、地面、身上整洁。</w:t>
-            </w:r>
-          </w:p>
-          <w:p>
-            <w:pPr>
-              <w:spacing w:line="300" w:lineRule="exact"/>
-              <w:rPr>
-                <w:rFonts w:ascii="宋体" w:hAnsi="宋体" w:cs="宋体"/>
-                <w:sz w:val="24"/>
-                <w:szCs w:val="24"/>
-              </w:rPr>
-            </w:pPr>
-            <w:r>
-              <w:rPr>
-                <w:rFonts w:ascii="宋体" w:hAnsi="宋体" w:cs="宋体" w:hint="eastAsia"/>
-                <w:sz w:val="24"/>
-                <w:szCs w:val="24"/>
-              </w:rPr>
-              <w:t>午睡：安静就寝，能自己又快又整齐地穿脱、折叠衣服和鞋子。</w:t>
             </w:r>
           </w:p>
         </w:tc>
@@ -5052,7 +3975,6 @@
                 <w:sz w:val="24"/>
                 <w:szCs w:val="24"/>
               </w:rPr>
-              <w:t>鼓励幼儿在家自己的事情自己做，学做爸爸妈妈的小帮手。</w:t>
             </w:r>
           </w:p>
         </w:tc>
@@ -5078,7 +4000,7 @@
           <w:sz w:val="32"/>
           <w:szCs w:val="32"/>
         </w:rPr>
-        <w:br w:type="page"/>
+        <w:t xml:space="preserve"/>
       </w:r>
     </w:p>
     <w:p>
@@ -5100,8 +4022,7 @@
           <w:sz w:val="32"/>
           <w:szCs w:val="32"/>
         </w:rPr>
-        <w:lastRenderedPageBreak/>
-        <w:t>南通市崇川区樾府幼儿园每周工作计划表</w:t>
+        <w:t xml:space="preserve"/>
       </w:r>
     </w:p>
     <w:p>
@@ -5119,7 +4040,7 @@
           <w:sz w:val="24"/>
           <w:szCs w:val="24"/>
         </w:rPr>
-        <w:t>主题名称：《香香的蔬菜》 班级：中四班 第（四）周（2026 年 9 月20日——9月24日）</w:t>
+        <w:t xml:space="preserve"/>
       </w:r>
     </w:p>
     <w:p>
@@ -5137,7 +4058,7 @@
           <w:sz w:val="24"/>
           <w:szCs w:val="24"/>
         </w:rPr>
-        <w:t>教师： 戚甦甦 岳炜  保育员：朱维维</w:t>
+        <w:t xml:space="preserve"/>
       </w:r>
     </w:p>
     <w:tbl>
@@ -5213,6 +4134,7 @@
                 <w:szCs w:val="24"/>
               </w:rPr>
             </w:pPr>
+            <w:r/>
           </w:p>
         </w:tc>
         <w:tc>
@@ -5241,7 +4163,6 @@
                 <w:sz w:val="24"/>
                 <w:szCs w:val="24"/>
               </w:rPr>
-              <w:t>周日</w:t>
             </w:r>
           </w:p>
         </w:tc>
@@ -5494,7 +4415,6 @@
                 <w:sz w:val="24"/>
                 <w:szCs w:val="24"/>
               </w:rPr>
-              <w:t>周日趣事分享</w:t>
             </w:r>
           </w:p>
         </w:tc>
@@ -5524,7 +4444,6 @@
                 <w:sz w:val="24"/>
                 <w:szCs w:val="24"/>
               </w:rPr>
-              <w:t>新的一周开始了</w:t>
             </w:r>
           </w:p>
         </w:tc>
@@ -5554,7 +4473,6 @@
                 <w:sz w:val="24"/>
                 <w:szCs w:val="24"/>
               </w:rPr>
-              <w:t>我的幼儿园生活</w:t>
             </w:r>
           </w:p>
         </w:tc>
@@ -5584,7 +4502,6 @@
                 <w:sz w:val="24"/>
                 <w:szCs w:val="24"/>
               </w:rPr>
-              <w:t>分享快乐的事</w:t>
             </w:r>
           </w:p>
         </w:tc>
@@ -5614,7 +4531,6 @@
                 <w:sz w:val="24"/>
                 <w:szCs w:val="24"/>
               </w:rPr>
-              <w:t>明日假期的期待</w:t>
             </w:r>
           </w:p>
         </w:tc>
@@ -5647,6 +4563,7 @@
                 <w:szCs w:val="24"/>
               </w:rPr>
             </w:pPr>
+            <w:r/>
           </w:p>
         </w:tc>
         <w:tc>
@@ -5723,7 +4640,6 @@
                 <w:sz w:val="24"/>
                 <w:szCs w:val="24"/>
               </w:rPr>
-              <w:t>语言：彩色牛奶</w:t>
             </w:r>
           </w:p>
         </w:tc>
@@ -5753,7 +4669,6 @@
                 <w:sz w:val="24"/>
                 <w:szCs w:val="24"/>
               </w:rPr>
-              <w:t>音乐：买菜</w:t>
             </w:r>
           </w:p>
         </w:tc>
@@ -5783,7 +4698,6 @@
                 <w:sz w:val="24"/>
                 <w:szCs w:val="24"/>
               </w:rPr>
-              <w:t>科学：泡泡都是圆的嘛？</w:t>
             </w:r>
           </w:p>
         </w:tc>
@@ -5813,7 +4727,6 @@
                 <w:sz w:val="24"/>
                 <w:szCs w:val="24"/>
               </w:rPr>
-              <w:t>科学：蔬菜哪个部位可以吃</w:t>
             </w:r>
           </w:p>
         </w:tc>
@@ -5843,23 +4756,6 @@
                 <w:sz w:val="24"/>
                 <w:szCs w:val="24"/>
               </w:rPr>
-              <w:t>健康</w:t>
-            </w:r>
-            <w:r>
-              <w:rPr>
-                <w:rFonts w:ascii="宋体" w:hAnsi="宋体" w:cs="宋体" w:hint="eastAsia"/>
-                <w:sz w:val="24"/>
-                <w:szCs w:val="24"/>
-              </w:rPr>
-              <w:t>：</w:t>
-            </w:r>
-            <w:r>
-              <w:rPr>
-                <w:rFonts w:ascii="宋体" w:hAnsi="宋体" w:cs="宋体" w:hint="eastAsia"/>
-                <w:sz w:val="24"/>
-                <w:szCs w:val="24"/>
-              </w:rPr>
-              <w:t>蚂蚁运粮</w:t>
             </w:r>
           </w:p>
         </w:tc>
@@ -5991,58 +4887,6 @@
                 <w:sz w:val="24"/>
                 <w:szCs w:val="24"/>
               </w:rPr>
-              <w:t>体能大循环</w:t>
-            </w:r>
-          </w:p>
-          <w:p>
-            <w:pPr>
-              <w:rPr>
-                <w:rFonts w:ascii="宋体" w:hAnsi="宋体" w:cs="宋体"/>
-                <w:sz w:val="24"/>
-                <w:szCs w:val="24"/>
-              </w:rPr>
-            </w:pPr>
-            <w:r>
-              <w:rPr>
-                <w:rFonts w:ascii="宋体" w:hAnsi="宋体" w:cs="宋体" w:hint="eastAsia"/>
-                <w:sz w:val="24"/>
-                <w:szCs w:val="24"/>
-              </w:rPr>
-              <w:t>集体游戏：1.《彩虹桥过河》（目标：①练习在“彩虹桥”（平衡木、竹梯）上两臂侧平举平稳行走，发展平衡能力和身体控制能力。②遵守排队等候、不推不挤的规则，学习在行进中避让同伴、保护自己。③在帮助小兔过桥收蔬菜的游戏情境中体验勇敢挑战的快乐。）</w:t>
-            </w:r>
-          </w:p>
-          <w:p>
-            <w:pPr>
-              <w:rPr>
-                <w:rFonts w:ascii="宋体" w:hAnsi="宋体" w:cs="宋体"/>
-                <w:sz w:val="24"/>
-                <w:szCs w:val="24"/>
-              </w:rPr>
-            </w:pPr>
-            <w:r>
-              <w:rPr>
-                <w:rFonts w:ascii="宋体" w:hAnsi="宋体" w:cs="宋体" w:hint="eastAsia"/>
-                <w:sz w:val="24"/>
-                <w:szCs w:val="24"/>
-              </w:rPr>
-              <w:t>2.《蔬菜运输队》（目标：①练习绕障碍跑和持物接力跑，发展奔跑能力和动作的灵敏性。②学习听信号交接“蔬菜”，与同伴合作完成运输任务，增强规则意识和团队合作精神。③在为菜市场送菜的游戏情境中感受劳动的快乐，萌发热爱劳动的情感。）</w:t>
-            </w:r>
-          </w:p>
-          <w:p>
-            <w:pPr>
-              <w:rPr>
-                <w:rFonts w:ascii="宋体" w:hAnsi="宋体" w:cs="宋体"/>
-                <w:sz w:val="24"/>
-                <w:szCs w:val="24"/>
-              </w:rPr>
-            </w:pPr>
-            <w:r>
-              <w:rPr>
-                <w:rFonts w:ascii="宋体" w:hAnsi="宋体" w:cs="宋体" w:hint="eastAsia"/>
-                <w:sz w:val="24"/>
-                <w:szCs w:val="24"/>
-              </w:rPr>
-              <w:t>自主游戏：《快乐爬爬乐》（目标：①练习手膝着地匍匐爬和手脚协调地钻爬，发展四肢力量与身体协调性。②自主探索爬网、隧道、软垫的多种玩法，大胆尝试不同的爬行动作和路线。③愿意与同伴轮流、交换器械，游戏后主动把器材送回原位，养成收拾整理的习惯。）</w:t>
             </w:r>
           </w:p>
         </w:tc>
@@ -6074,6 +4918,7 @@
                 <w:szCs w:val="24"/>
               </w:rPr>
             </w:pPr>
+            <w:r/>
           </w:p>
         </w:tc>
         <w:tc>
@@ -6150,177 +4995,6 @@
                 <w:sz w:val="24"/>
                 <w:szCs w:val="24"/>
               </w:rPr>
-              <w:t>1.户外游戏 2.区域游戏 3.专用室</w:t>
-            </w:r>
-          </w:p>
-          <w:p>
-            <w:pPr>
-              <w:rPr>
-                <w:rFonts w:ascii="宋体" w:hAnsi="宋体" w:cs="宋体"/>
-                <w:sz w:val="24"/>
-                <w:szCs w:val="24"/>
-              </w:rPr>
-            </w:pPr>
-            <w:r>
-              <w:rPr>
-                <w:rFonts w:ascii="宋体" w:hAnsi="宋体" w:cs="宋体" w:hint="eastAsia"/>
-                <w:sz w:val="24"/>
-                <w:szCs w:val="24"/>
-              </w:rPr>
-              <w:t>本周重点指导区域：蜜雪冰城（手打柠檬饮品店）</w:t>
-            </w:r>
-          </w:p>
-          <w:p>
-            <w:pPr>
-              <w:rPr>
-                <w:rFonts w:ascii="宋体" w:hAnsi="宋体" w:cs="宋体"/>
-                <w:sz w:val="24"/>
-                <w:szCs w:val="24"/>
-              </w:rPr>
-            </w:pPr>
-            <w:r>
-              <w:rPr>
-                <w:rFonts w:ascii="宋体" w:hAnsi="宋体" w:cs="宋体" w:hint="eastAsia"/>
-                <w:sz w:val="24"/>
-                <w:szCs w:val="24"/>
-              </w:rPr>
-              <w:t>目标：</w:t>
-            </w:r>
-          </w:p>
-          <w:p>
-            <w:pPr>
-              <w:rPr>
-                <w:rFonts w:ascii="宋体" w:hAnsi="宋体" w:cs="宋体"/>
-                <w:sz w:val="24"/>
-                <w:szCs w:val="24"/>
-              </w:rPr>
-            </w:pPr>
-            <w:r>
-              <w:rPr>
-                <w:rFonts w:ascii="宋体" w:hAnsi="宋体" w:cs="宋体" w:hint="eastAsia"/>
-                <w:sz w:val="24"/>
-                <w:szCs w:val="24"/>
-              </w:rPr>
-              <w:t>1.了解饮品店收银员、服务员、顾客等角色的职责，能使用“欢迎光临”“请问需要什么”“谢谢光临”等礼貌用语进行角色交往。</w:t>
-            </w:r>
-          </w:p>
-          <w:p>
-            <w:pPr>
-              <w:rPr>
-                <w:rFonts w:ascii="宋体" w:hAnsi="宋体" w:cs="宋体"/>
-                <w:sz w:val="24"/>
-                <w:szCs w:val="24"/>
-              </w:rPr>
-            </w:pPr>
-            <w:r>
-              <w:rPr>
-                <w:rFonts w:ascii="宋体" w:hAnsi="宋体" w:cs="宋体" w:hint="eastAsia"/>
-                <w:sz w:val="24"/>
-                <w:szCs w:val="24"/>
-              </w:rPr>
-              <w:t>2.能围绕“点单——制作——购买——收拾”的情节展开游戏，发展语言表达、同伴交往能力和简单的数概念运用能力。</w:t>
-            </w:r>
-          </w:p>
-          <w:p>
-            <w:pPr>
-              <w:rPr>
-                <w:rFonts w:ascii="宋体" w:hAnsi="宋体" w:cs="宋体"/>
-                <w:sz w:val="24"/>
-                <w:szCs w:val="24"/>
-              </w:rPr>
-            </w:pPr>
-            <w:r>
-              <w:rPr>
-                <w:rFonts w:ascii="宋体" w:hAnsi="宋体" w:cs="宋体" w:hint="eastAsia"/>
-                <w:sz w:val="24"/>
-                <w:szCs w:val="24"/>
-              </w:rPr>
-              <w:t>3.学习正确使用雪克杯、夹子、纸杯等游戏材料，游戏结束后能按分类整理归位。</w:t>
-            </w:r>
-          </w:p>
-          <w:p>
-            <w:pPr>
-              <w:rPr>
-                <w:rFonts w:ascii="宋体" w:hAnsi="宋体" w:cs="宋体"/>
-                <w:sz w:val="24"/>
-                <w:szCs w:val="24"/>
-              </w:rPr>
-            </w:pPr>
-            <w:r>
-              <w:rPr>
-                <w:rFonts w:ascii="宋体" w:hAnsi="宋体" w:cs="宋体" w:hint="eastAsia"/>
-                <w:sz w:val="24"/>
-                <w:szCs w:val="24"/>
-              </w:rPr>
-              <w:t>材料：菜单价目表、仿真柠檬和水果、手打棒、雪克杯、纸杯、吸管、号码牌。</w:t>
-            </w:r>
-          </w:p>
-          <w:p>
-            <w:pPr>
-              <w:rPr>
-                <w:rFonts w:ascii="宋体" w:hAnsi="宋体" w:cs="宋体"/>
-                <w:sz w:val="24"/>
-                <w:szCs w:val="24"/>
-              </w:rPr>
-            </w:pPr>
-            <w:r>
-              <w:rPr>
-                <w:rFonts w:ascii="宋体" w:hAnsi="宋体" w:cs="宋体" w:hint="eastAsia"/>
-                <w:sz w:val="24"/>
-                <w:szCs w:val="24"/>
-              </w:rPr>
-              <w:t>指导：</w:t>
-            </w:r>
-          </w:p>
-          <w:p>
-            <w:pPr>
-              <w:rPr>
-                <w:rFonts w:ascii="宋体" w:hAnsi="宋体" w:cs="宋体"/>
-                <w:sz w:val="24"/>
-                <w:szCs w:val="24"/>
-              </w:rPr>
-            </w:pPr>
-            <w:r>
-              <w:rPr>
-                <w:rFonts w:ascii="宋体" w:hAnsi="宋体" w:cs="宋体" w:hint="eastAsia"/>
-                <w:sz w:val="24"/>
-                <w:szCs w:val="24"/>
-              </w:rPr>
-              <w:t>1.游戏前结合逛菜场、买饮品的生活经验谈话，借助门店照片、视频帮助幼儿明确角色分工与游戏流程。</w:t>
-            </w:r>
-          </w:p>
-          <w:p>
-            <w:pPr>
-              <w:rPr>
-                <w:rFonts w:ascii="宋体" w:hAnsi="宋体" w:cs="宋体"/>
-                <w:sz w:val="24"/>
-                <w:szCs w:val="24"/>
-              </w:rPr>
-            </w:pPr>
-            <w:r>
-              <w:rPr>
-                <w:rFonts w:ascii="宋体" w:hAnsi="宋体" w:cs="宋体" w:hint="eastAsia"/>
-                <w:sz w:val="24"/>
-                <w:szCs w:val="24"/>
-              </w:rPr>
-              <w:t>2.游戏中教师以顾客身份自然介入，示范礼貌交往语言和手打柠檬茶的制作步骤，鼓励幼儿拓展外卖、团购等新情节。</w:t>
-            </w:r>
-          </w:p>
-          <w:p>
-            <w:pPr>
-              <w:rPr>
-                <w:rFonts w:ascii="宋体" w:hAnsi="宋体" w:cs="宋体"/>
-                <w:sz w:val="24"/>
-                <w:szCs w:val="24"/>
-              </w:rPr>
-            </w:pPr>
-            <w:r>
-              <w:rPr>
-                <w:rFonts w:ascii="宋体" w:hAnsi="宋体" w:cs="宋体" w:hint="eastAsia"/>
-                <w:sz w:val="24"/>
-                <w:szCs w:val="24"/>
-              </w:rPr>
-              <w:t>3.游戏后组织分享交流，针对材料乱放的问题引导幼儿完善按标记分类整理的规则。</w:t>
             </w:r>
           </w:p>
         </w:tc>
@@ -6403,41 +5077,6 @@
                 <w:sz w:val="24"/>
                 <w:szCs w:val="24"/>
               </w:rPr>
-              <w:t>1.认识常见蔬菜，知道蔬菜有根、茎、叶、花、果实、种子不同的食用部位，了解葱、蒜与人们生活的关系，愿意吃各种蔬菜、不挑食。</w:t>
-            </w:r>
-          </w:p>
-          <w:p>
-            <w:pPr>
-              <w:rPr>
-                <w:rFonts w:ascii="宋体" w:hAnsi="宋体" w:cs="宋体"/>
-                <w:sz w:val="24"/>
-                <w:szCs w:val="24"/>
-              </w:rPr>
-            </w:pPr>
-            <w:r>
-              <w:rPr>
-                <w:rFonts w:ascii="宋体" w:hAnsi="宋体" w:cs="宋体" w:hint="eastAsia"/>
-                <w:sz w:val="24"/>
-                <w:szCs w:val="24"/>
-              </w:rPr>
-              <w:t>2.能用说唱结合的方式演唱歌曲《买菜》，尝试根据故事的情节线索仿编句子，大胆地在集体面前表达自己的想法。</w:t>
-            </w:r>
-          </w:p>
-          <w:p>
-            <w:pPr>
-              <w:rPr>
-                <w:rFonts w:ascii="宋体" w:hAnsi="宋体" w:cs="宋体"/>
-                <w:sz w:val="24"/>
-                <w:szCs w:val="24"/>
-              </w:rPr>
-            </w:pPr>
-            <w:r>
-              <w:rPr>
-                <w:rFonts w:ascii="宋体" w:hAnsi="宋体" w:cs="宋体" w:hint="eastAsia"/>
-                <w:sz w:val="24"/>
-                <w:szCs w:val="24"/>
-              </w:rPr>
-              <w:t>3.在吹泡泡、比较葱和蒜等探究活动中，学习用多种感官观察和表达，体验科学探究的乐趣。</w:t>
             </w:r>
           </w:p>
         </w:tc>
@@ -6520,41 +5159,6 @@
                 <w:sz w:val="24"/>
                 <w:szCs w:val="24"/>
               </w:rPr>
-              <w:t>1.创设“香香的蔬菜”主题墙，布置常见蔬菜图片和蔬菜食用部位分类图，。</w:t>
-            </w:r>
-          </w:p>
-          <w:p>
-            <w:pPr>
-              <w:rPr>
-                <w:rFonts w:ascii="宋体" w:hAnsi="宋体" w:cs="宋体"/>
-                <w:sz w:val="24"/>
-                <w:szCs w:val="24"/>
-              </w:rPr>
-            </w:pPr>
-            <w:r>
-              <w:rPr>
-                <w:rFonts w:ascii="宋体" w:hAnsi="宋体" w:cs="宋体" w:hint="eastAsia"/>
-                <w:sz w:val="24"/>
-                <w:szCs w:val="24"/>
-              </w:rPr>
-              <w:t>2.丰富自然角，投放葱、蒜、萝卜等可以水培发芽的蔬菜，引导幼儿观察并记录蔬菜的生长变化。</w:t>
-            </w:r>
-          </w:p>
-          <w:p>
-            <w:pPr>
-              <w:rPr>
-                <w:rFonts w:ascii="宋体" w:hAnsi="宋体" w:cs="宋体"/>
-                <w:sz w:val="24"/>
-                <w:szCs w:val="24"/>
-              </w:rPr>
-            </w:pPr>
-            <w:r>
-              <w:rPr>
-                <w:rFonts w:ascii="宋体" w:hAnsi="宋体" w:cs="宋体" w:hint="eastAsia"/>
-                <w:sz w:val="24"/>
-                <w:szCs w:val="24"/>
-              </w:rPr>
-              <w:t>3.在角色区创设“蜜雪冰城·手打柠檬饮品店”游戏情境，。</w:t>
             </w:r>
           </w:p>
         </w:tc>
@@ -6655,41 +5259,6 @@
                 <w:sz w:val="24"/>
                 <w:szCs w:val="24"/>
               </w:rPr>
-              <w:t>卫生：接触蔬菜、操作实验材料前后能用七步洗手法主动洗手，不把物品放入口、眼中。</w:t>
-            </w:r>
-          </w:p>
-          <w:p>
-            <w:pPr>
-              <w:rPr>
-                <w:rFonts w:ascii="宋体" w:hAnsi="宋体" w:cs="宋体"/>
-                <w:sz w:val="24"/>
-                <w:szCs w:val="24"/>
-              </w:rPr>
-            </w:pPr>
-            <w:r>
-              <w:rPr>
-                <w:rFonts w:ascii="宋体" w:hAnsi="宋体" w:cs="宋体" w:hint="eastAsia"/>
-                <w:sz w:val="24"/>
-                <w:szCs w:val="24"/>
-              </w:rPr>
-              <w:t>午餐：知道各种蔬菜都有营养，乐意品尝不同的蔬菜，不挑食、不剩饭，保持桌面整洁。</w:t>
-            </w:r>
-          </w:p>
-          <w:p>
-            <w:pPr>
-              <w:rPr>
-                <w:rFonts w:ascii="宋体" w:hAnsi="宋体" w:cs="宋体"/>
-                <w:sz w:val="24"/>
-                <w:szCs w:val="24"/>
-              </w:rPr>
-            </w:pPr>
-            <w:r>
-              <w:rPr>
-                <w:rFonts w:ascii="宋体" w:hAnsi="宋体" w:cs="宋体" w:hint="eastAsia"/>
-                <w:sz w:val="24"/>
-                <w:szCs w:val="24"/>
-              </w:rPr>
-              <w:t>午睡：安静就寝，能自己又快又整齐地穿脱、折叠衣服和摆放鞋子。</w:t>
             </w:r>
           </w:p>
         </w:tc>
@@ -6772,7 +5341,6 @@
                 <w:sz w:val="24"/>
                 <w:szCs w:val="24"/>
               </w:rPr>
-              <w:t>请家长带幼儿到菜市场或超市买菜，向幼儿介绍蔬菜的名称和食用部位，鼓励孩子参与择菜、洗菜等力所能及的家务，养成爱吃蔬菜、不挑食的好习惯。</w:t>
             </w:r>
           </w:p>
         </w:tc>
@@ -6797,8 +5365,7 @@
           <w:sz w:val="32"/>
           <w:szCs w:val="32"/>
         </w:rPr>
-        <w:lastRenderedPageBreak/>
-        <w:t>南通市崇川区樾府幼儿园每周工作计划表</w:t>
+        <w:t xml:space="preserve"/>
       </w:r>
     </w:p>
     <w:p>
@@ -6816,7 +5383,7 @@
           <w:sz w:val="24"/>
           <w:szCs w:val="24"/>
         </w:rPr>
-        <w:t>主题名称：《香香的蔬菜》 班级：中四班 第（五）周（2026 年 9 月28日——9月30日）</w:t>
+        <w:t xml:space="preserve"/>
       </w:r>
     </w:p>
     <w:p>
@@ -6834,7 +5401,7 @@
           <w:sz w:val="24"/>
           <w:szCs w:val="24"/>
         </w:rPr>
-        <w:t>教师： 戚甦甦 岳炜  保育员：朱维维</w:t>
+        <w:t xml:space="preserve"/>
       </w:r>
     </w:p>
     <w:tbl>
@@ -6910,6 +5477,7 @@
                 <w:szCs w:val="24"/>
               </w:rPr>
             </w:pPr>
+            <w:r/>
           </w:p>
         </w:tc>
         <w:tc>
@@ -7191,7 +5759,6 @@
                 <w:sz w:val="24"/>
                 <w:szCs w:val="24"/>
               </w:rPr>
-              <w:t>蔬菜儿歌的乐趣</w:t>
             </w:r>
           </w:p>
         </w:tc>
@@ -7221,7 +5788,6 @@
                 <w:sz w:val="24"/>
                 <w:szCs w:val="24"/>
               </w:rPr>
-              <w:t>秋天的树叶</w:t>
             </w:r>
           </w:p>
         </w:tc>
@@ -7251,7 +5817,6 @@
                 <w:sz w:val="24"/>
                 <w:szCs w:val="24"/>
               </w:rPr>
-              <w:t>节日的快乐</w:t>
             </w:r>
           </w:p>
         </w:tc>
@@ -7282,7 +5847,6 @@
                 <w:sz w:val="24"/>
                 <w:szCs w:val="24"/>
               </w:rPr>
-              <w:t>国庆放假</w:t>
             </w:r>
           </w:p>
         </w:tc>
@@ -7315,6 +5879,7 @@
                 <w:szCs w:val="24"/>
               </w:rPr>
             </w:pPr>
+            <w:r/>
           </w:p>
         </w:tc>
         <w:tc>
@@ -7391,7 +5956,6 @@
                 <w:sz w:val="24"/>
                 <w:szCs w:val="24"/>
               </w:rPr>
-              <w:t>语言：菜地里的歌</w:t>
             </w:r>
           </w:p>
         </w:tc>
@@ -7421,7 +5985,6 @@
                 <w:sz w:val="24"/>
                 <w:szCs w:val="24"/>
               </w:rPr>
-              <w:t>科学：蔬菜里面的秘密</w:t>
             </w:r>
           </w:p>
         </w:tc>
@@ -7451,7 +6014,6 @@
                 <w:sz w:val="24"/>
                 <w:szCs w:val="24"/>
               </w:rPr>
-              <w:t>社会：国庆节</w:t>
             </w:r>
           </w:p>
         </w:tc>
@@ -7476,6 +6038,7 @@
                 <w:szCs w:val="24"/>
               </w:rPr>
             </w:pPr>
+            <w:r/>
           </w:p>
         </w:tc>
       </w:tr>
@@ -7606,41 +6169,6 @@
                 <w:sz w:val="24"/>
                 <w:szCs w:val="24"/>
               </w:rPr>
-              <w:t>体能大循环</w:t>
-            </w:r>
-          </w:p>
-          <w:p>
-            <w:pPr>
-              <w:rPr>
-                <w:rFonts w:ascii="宋体" w:hAnsi="宋体" w:cs="宋体"/>
-                <w:sz w:val="24"/>
-                <w:szCs w:val="24"/>
-              </w:rPr>
-            </w:pPr>
-            <w:r>
-              <w:rPr>
-                <w:rFonts w:ascii="宋体" w:hAnsi="宋体" w:cs="宋体" w:hint="eastAsia"/>
-                <w:sz w:val="24"/>
-                <w:szCs w:val="24"/>
-              </w:rPr>
-              <w:t>集体游戏：1.《蔬菜采摘接力》（目标：①练习听信号快速跑和绕过障碍物跑，发展奔跑能力与身体灵敏性。②学会双手“采摘”蔬菜并与同伴接力交接，遵守排队等待、为同伴加油的游戏规则。③在丰收采摘的游戏情境中体验劳动的喜悦和集体接力的荣誉感。）</w:t>
-            </w:r>
-          </w:p>
-          <w:p>
-            <w:pPr>
-              <w:rPr>
-                <w:rFonts w:ascii="宋体" w:hAnsi="宋体" w:cs="宋体"/>
-                <w:sz w:val="24"/>
-                <w:szCs w:val="24"/>
-              </w:rPr>
-            </w:pPr>
-            <w:r>
-              <w:rPr>
-                <w:rFonts w:ascii="宋体" w:hAnsi="宋体" w:cs="宋体" w:hint="eastAsia"/>
-                <w:sz w:val="24"/>
-                <w:szCs w:val="24"/>
-              </w:rPr>
-              <w:t>2.《勇敢投弹手》（目标：①练习肩上挥臂投掷，尝试投准2—3米的目标，发展上肢力量和手眼协调能力。②遵守站在线后投掷、听口令统一捡沙包的规则，建立安全有序的活动常规。③在“打害虫、保蔬菜”的游戏中体验投中目标的成功感，萌发爱护蔬菜的情感。）自主游戏：《障碍跑酷小达人》（目标：①自主组合钻圈、跨栏、平衡木等器械开展障碍跑酷，发展钻、爬、跨、跳等综合运动能力。②能与同伴协商设计游戏路线、轮流进行游戏，自觉遵守共同约定的规则。③敢于挑战有难度的路线，游戏结束后主动与同伴一起收拾器械。）</w:t>
             </w:r>
           </w:p>
         </w:tc>
@@ -7672,6 +6200,7 @@
                 <w:szCs w:val="24"/>
               </w:rPr>
             </w:pPr>
+            <w:r/>
           </w:p>
         </w:tc>
         <w:tc>
@@ -7748,177 +6277,6 @@
                 <w:sz w:val="24"/>
                 <w:szCs w:val="24"/>
               </w:rPr>
-              <w:t>1.户外游戏 2.区域游戏 3.专用室</w:t>
-            </w:r>
-          </w:p>
-          <w:p>
-            <w:pPr>
-              <w:rPr>
-                <w:rFonts w:ascii="宋体" w:hAnsi="宋体" w:cs="宋体"/>
-                <w:sz w:val="24"/>
-                <w:szCs w:val="24"/>
-              </w:rPr>
-            </w:pPr>
-            <w:r>
-              <w:rPr>
-                <w:rFonts w:ascii="宋体" w:hAnsi="宋体" w:cs="宋体" w:hint="eastAsia"/>
-                <w:sz w:val="24"/>
-                <w:szCs w:val="24"/>
-              </w:rPr>
-              <w:t>本周重点指导区域：美工区（蔬菜与自然物创意制作）</w:t>
-            </w:r>
-          </w:p>
-          <w:p>
-            <w:pPr>
-              <w:rPr>
-                <w:rFonts w:ascii="宋体" w:hAnsi="宋体" w:cs="宋体"/>
-                <w:sz w:val="24"/>
-                <w:szCs w:val="24"/>
-              </w:rPr>
-            </w:pPr>
-            <w:r>
-              <w:rPr>
-                <w:rFonts w:ascii="宋体" w:hAnsi="宋体" w:cs="宋体" w:hint="eastAsia"/>
-                <w:sz w:val="24"/>
-                <w:szCs w:val="24"/>
-              </w:rPr>
-              <w:t>目标：</w:t>
-            </w:r>
-          </w:p>
-          <w:p>
-            <w:pPr>
-              <w:rPr>
-                <w:rFonts w:ascii="宋体" w:hAnsi="宋体" w:cs="宋体"/>
-                <w:sz w:val="24"/>
-                <w:szCs w:val="24"/>
-              </w:rPr>
-            </w:pPr>
-            <w:r>
-              <w:rPr>
-                <w:rFonts w:ascii="宋体" w:hAnsi="宋体" w:cs="宋体" w:hint="eastAsia"/>
-                <w:sz w:val="24"/>
-                <w:szCs w:val="24"/>
-              </w:rPr>
-              <w:t>1.尝试用蔬菜切面印画、自然物拼贴和超轻黏土捏塑等方式表现自己喜欢的蔬菜，发展手部精细动作和审美表现力。</w:t>
-            </w:r>
-          </w:p>
-          <w:p>
-            <w:pPr>
-              <w:rPr>
-                <w:rFonts w:ascii="宋体" w:hAnsi="宋体" w:cs="宋体"/>
-                <w:sz w:val="24"/>
-                <w:szCs w:val="24"/>
-              </w:rPr>
-            </w:pPr>
-            <w:r>
-              <w:rPr>
-                <w:rFonts w:ascii="宋体" w:hAnsi="宋体" w:cs="宋体" w:hint="eastAsia"/>
-                <w:sz w:val="24"/>
-                <w:szCs w:val="24"/>
-              </w:rPr>
-              <w:t>2.能根据蔬菜和自然材料的外形特征大胆想象、自主创作作品，并愿意向同伴介绍自己的作品。</w:t>
-            </w:r>
-          </w:p>
-          <w:p>
-            <w:pPr>
-              <w:rPr>
-                <w:rFonts w:ascii="宋体" w:hAnsi="宋体" w:cs="宋体"/>
-                <w:sz w:val="24"/>
-                <w:szCs w:val="24"/>
-              </w:rPr>
-            </w:pPr>
-            <w:r>
-              <w:rPr>
-                <w:rFonts w:ascii="宋体" w:hAnsi="宋体" w:cs="宋体" w:hint="eastAsia"/>
-                <w:sz w:val="24"/>
-                <w:szCs w:val="24"/>
-              </w:rPr>
-              <w:t>3.学习安全使用小剪刀、模具等工具，与同伴协商共用材料，活动后能归类整理。</w:t>
-            </w:r>
-          </w:p>
-          <w:p>
-            <w:pPr>
-              <w:rPr>
-                <w:rFonts w:ascii="宋体" w:hAnsi="宋体" w:cs="宋体"/>
-                <w:sz w:val="24"/>
-                <w:szCs w:val="24"/>
-              </w:rPr>
-            </w:pPr>
-            <w:r>
-              <w:rPr>
-                <w:rFonts w:ascii="宋体" w:hAnsi="宋体" w:cs="宋体" w:hint="eastAsia"/>
-                <w:sz w:val="24"/>
-                <w:szCs w:val="24"/>
-              </w:rPr>
-              <w:t>材料：藕、青椒、胡萝卜等蔬菜切面，水粉颜料、画纸、彩纸、安全剪刀、胶棒、超轻黏土，树叶、树枝、松果等自然物，“蔬菜乐园”作品展示板等。</w:t>
-            </w:r>
-          </w:p>
-          <w:p>
-            <w:pPr>
-              <w:rPr>
-                <w:rFonts w:ascii="宋体" w:hAnsi="宋体" w:cs="宋体"/>
-                <w:sz w:val="24"/>
-                <w:szCs w:val="24"/>
-              </w:rPr>
-            </w:pPr>
-            <w:r>
-              <w:rPr>
-                <w:rFonts w:ascii="宋体" w:hAnsi="宋体" w:cs="宋体" w:hint="eastAsia"/>
-                <w:sz w:val="24"/>
-                <w:szCs w:val="24"/>
-              </w:rPr>
-              <w:t>指导：</w:t>
-            </w:r>
-          </w:p>
-          <w:p>
-            <w:pPr>
-              <w:rPr>
-                <w:rFonts w:ascii="宋体" w:hAnsi="宋体" w:cs="宋体"/>
-                <w:sz w:val="24"/>
-                <w:szCs w:val="24"/>
-              </w:rPr>
-            </w:pPr>
-            <w:r>
-              <w:rPr>
-                <w:rFonts w:ascii="宋体" w:hAnsi="宋体" w:cs="宋体" w:hint="eastAsia"/>
-                <w:sz w:val="24"/>
-                <w:szCs w:val="24"/>
-              </w:rPr>
-              <w:t>1.游戏前结合“蔬菜里面的秘密”活动，引导幼儿欣赏蔬菜切面的图案，讨论它们像什么，支持幼儿大胆构想创作内容。</w:t>
-            </w:r>
-          </w:p>
-          <w:p>
-            <w:pPr>
-              <w:rPr>
-                <w:rFonts w:ascii="宋体" w:hAnsi="宋体" w:cs="宋体"/>
-                <w:sz w:val="24"/>
-                <w:szCs w:val="24"/>
-              </w:rPr>
-            </w:pPr>
-            <w:r>
-              <w:rPr>
-                <w:rFonts w:ascii="宋体" w:hAnsi="宋体" w:cs="宋体" w:hint="eastAsia"/>
-                <w:sz w:val="24"/>
-                <w:szCs w:val="24"/>
-              </w:rPr>
-              <w:t>2.游戏中观察幼儿印画、拼贴、捏塑的情况，对动手能力较弱的幼儿示范蘸色轻压、擦手换色等技能，鼓励能力强的幼儿合作完成“菜地里的歌”组画。</w:t>
-            </w:r>
-          </w:p>
-          <w:p>
-            <w:pPr>
-              <w:rPr>
-                <w:rFonts w:ascii="宋体" w:hAnsi="宋体" w:cs="宋体"/>
-                <w:sz w:val="24"/>
-                <w:szCs w:val="24"/>
-              </w:rPr>
-            </w:pPr>
-            <w:r>
-              <w:rPr>
-                <w:rFonts w:ascii="宋体" w:hAnsi="宋体" w:cs="宋体" w:hint="eastAsia"/>
-                <w:sz w:val="24"/>
-                <w:szCs w:val="24"/>
-              </w:rPr>
-              <w:t>3.游戏后举办“蔬菜乐园”作品展，引导幼儿介绍自己的作品，并按标记清洗、归位工具和材料。</w:t>
             </w:r>
           </w:p>
         </w:tc>
@@ -8001,41 +6359,6 @@
                 <w:sz w:val="24"/>
                 <w:szCs w:val="24"/>
               </w:rPr>
-              <w:t>1.理解儿歌《菜地里的歌》的内容，了解常见蔬菜的外形特征和生长环境，体验问答式儿歌的乐趣并尝试续编。</w:t>
-            </w:r>
-          </w:p>
-          <w:p>
-            <w:pPr>
-              <w:rPr>
-                <w:rFonts w:ascii="宋体" w:hAnsi="宋体" w:cs="宋体"/>
-                <w:sz w:val="24"/>
-                <w:szCs w:val="24"/>
-              </w:rPr>
-            </w:pPr>
-            <w:r>
-              <w:rPr>
-                <w:rFonts w:ascii="宋体" w:hAnsi="宋体" w:cs="宋体" w:hint="eastAsia"/>
-                <w:sz w:val="24"/>
-                <w:szCs w:val="24"/>
-              </w:rPr>
-              <w:t>2.通过看一看、切一切发现蔬菜切面里藏着的不同图案，学习安全使用小刀，能细心观察、大胆猜想并用语言表达自己的发现。</w:t>
-            </w:r>
-          </w:p>
-          <w:p>
-            <w:pPr>
-              <w:rPr>
-                <w:rFonts w:ascii="宋体" w:hAnsi="宋体" w:cs="宋体"/>
-                <w:sz w:val="24"/>
-                <w:szCs w:val="24"/>
-              </w:rPr>
-            </w:pPr>
-            <w:r>
-              <w:rPr>
-                <w:rFonts w:ascii="宋体" w:hAnsi="宋体" w:cs="宋体" w:hint="eastAsia"/>
-                <w:sz w:val="24"/>
-                <w:szCs w:val="24"/>
-              </w:rPr>
-              <w:t>3.知道十月一日是国庆节，感受节日的欢乐气氛，萌发热爱祖国的情感，了解假期安全常识。</w:t>
             </w:r>
           </w:p>
         </w:tc>
@@ -8118,41 +6441,6 @@
                 <w:sz w:val="24"/>
                 <w:szCs w:val="24"/>
               </w:rPr>
-              <w:t>1.丰富“香香的蔬菜”主题墙，呈现幼儿续编的蔬菜儿歌图文记录和蔬菜切面印画作品。</w:t>
-            </w:r>
-          </w:p>
-          <w:p>
-            <w:pPr>
-              <w:rPr>
-                <w:rFonts w:ascii="宋体" w:hAnsi="宋体" w:cs="宋体"/>
-                <w:sz w:val="24"/>
-                <w:szCs w:val="24"/>
-              </w:rPr>
-            </w:pPr>
-            <w:r>
-              <w:rPr>
-                <w:rFonts w:ascii="宋体" w:hAnsi="宋体" w:cs="宋体" w:hint="eastAsia"/>
-                <w:sz w:val="24"/>
-                <w:szCs w:val="24"/>
-              </w:rPr>
-              <w:t>2.在美工区投放蔬菜切面、颜料和秋季自然物，支持幼儿开展创意印画和自然物拼贴活动。</w:t>
-            </w:r>
-          </w:p>
-          <w:p>
-            <w:pPr>
-              <w:rPr>
-                <w:rFonts w:ascii="宋体" w:hAnsi="宋体" w:cs="宋体"/>
-                <w:sz w:val="24"/>
-                <w:szCs w:val="24"/>
-              </w:rPr>
-            </w:pPr>
-            <w:r>
-              <w:rPr>
-                <w:rFonts w:ascii="宋体" w:hAnsi="宋体" w:cs="宋体" w:hint="eastAsia"/>
-                <w:sz w:val="24"/>
-                <w:szCs w:val="24"/>
-              </w:rPr>
-              <w:t>3.师幼共同创设“欢度国庆”节日环境，张贴国旗、悬挂红灯笼，营造喜庆的节日氛围。</w:t>
             </w:r>
           </w:p>
         </w:tc>
@@ -8253,41 +6541,6 @@
                 <w:sz w:val="24"/>
                 <w:szCs w:val="24"/>
               </w:rPr>
-              <w:t>卫生：在切蔬菜、印画活动后能及时用七步洗手法洗净双手，户外活动后主动擦汗、饮水。</w:t>
-            </w:r>
-          </w:p>
-          <w:p>
-            <w:pPr>
-              <w:rPr>
-                <w:rFonts w:ascii="宋体" w:hAnsi="宋体" w:cs="宋体"/>
-                <w:sz w:val="24"/>
-                <w:szCs w:val="24"/>
-              </w:rPr>
-            </w:pPr>
-            <w:r>
-              <w:rPr>
-                <w:rFonts w:ascii="宋体" w:hAnsi="宋体" w:cs="宋体" w:hint="eastAsia"/>
-                <w:sz w:val="24"/>
-                <w:szCs w:val="24"/>
-              </w:rPr>
-              <w:t>午餐：继续养成不挑食、不偏食的进餐习惯，爱吃多种蔬菜，保持桌面、地面整洁。</w:t>
-            </w:r>
-          </w:p>
-          <w:p>
-            <w:pPr>
-              <w:rPr>
-                <w:rFonts w:ascii="宋体" w:hAnsi="宋体" w:cs="宋体"/>
-                <w:sz w:val="24"/>
-                <w:szCs w:val="24"/>
-              </w:rPr>
-            </w:pPr>
-            <w:r>
-              <w:rPr>
-                <w:rFonts w:ascii="宋体" w:hAnsi="宋体" w:cs="宋体" w:hint="eastAsia"/>
-                <w:sz w:val="24"/>
-                <w:szCs w:val="24"/>
-              </w:rPr>
-              <w:t>午睡：睡前自觉折叠、摆放好衣物，安静快速入睡，醒后轻声起床不影响同伴。</w:t>
             </w:r>
           </w:p>
         </w:tc>
@@ -8370,7 +6623,6 @@
                 <w:sz w:val="24"/>
                 <w:szCs w:val="24"/>
               </w:rPr>
-              <w:t>请家长利用国庆假期带幼儿感受节日气氛，做好出行安全和饮食卫生教育；和幼儿一起品尝、认识各种蔬菜，鼓励孩子参与择菜、洗菜等家务，巩固爱吃蔬菜、不挑食的好习惯。</w:t>
             </w:r>
           </w:p>
         </w:tc>
@@ -8388,6 +6640,9 @@
           <w:szCs w:val="32"/>
         </w:rPr>
       </w:pPr>
+      <w:r>
+        <w:t xml:space="preserve"/>
+      </w:r>
     </w:p>
     <w:sectPr>
       <w:pgSz w:w="11906" w:h="16838"/>

</xml_diff>